<commit_message>
add dtbo to enable dual camera for cm4
</commit_message>
<xml_diff>
--- a/OV7251 Manual-bref.docx
+++ b/OV7251 Manual-bref.docx
@@ -303,8 +303,6 @@
       <w:pPr>
         <w:bidi w:val="0"/>
       </w:pPr>
-      <w:bookmarkStart w:id="0" w:name="_GoBack"/>
-      <w:bookmarkEnd w:id="0"/>
       <w:r>
         <w:rPr>
           <w:rFonts w:hint="eastAsia"/>
@@ -645,6 +643,7 @@
     </w:p>
     <w:tbl>
       <w:tblPr>
+        <w:tblStyle w:val="10"/>
         <w:tblW w:w="6140" w:type="dxa"/>
         <w:tblInd w:w="93" w:type="dxa"/>
         <w:tblBorders>
@@ -655,7 +654,7 @@
           <w:insideH w:val="none" w:color="auto" w:sz="0" w:space="0"/>
           <w:insideV w:val="none" w:color="auto" w:sz="0" w:space="0"/>
         </w:tblBorders>
-        <w:shd w:val="clear"/>
+        <w:shd w:val="clear" w:color="auto" w:fill="auto"/>
         <w:tblLayout w:type="autofit"/>
         <w:tblCellMar>
           <w:top w:w="0" w:type="dxa"/>
@@ -678,7 +677,7 @@
             <w:insideH w:val="none" w:color="auto" w:sz="0" w:space="0"/>
             <w:insideV w:val="none" w:color="auto" w:sz="0" w:space="0"/>
           </w:tblBorders>
-          <w:shd w:val="clear"/>
+          <w:shd w:val="clear" w:color="auto" w:fill="auto"/>
           <w:tblCellMar>
             <w:top w:w="0" w:type="dxa"/>
             <w:left w:w="108" w:type="dxa"/>
@@ -698,7 +697,7 @@
               <w:bottom w:val="single" w:color="auto" w:sz="4" w:space="0"/>
               <w:right w:val="single" w:color="auto" w:sz="4" w:space="0"/>
             </w:tcBorders>
-            <w:shd w:val="clear"/>
+            <w:shd w:val="clear" w:color="auto" w:fill="auto"/>
             <w:noWrap/>
             <w:vAlign w:val="center"/>
           </w:tcPr>
@@ -730,7 +729,7 @@
               <w:bottom w:val="single" w:color="auto" w:sz="4" w:space="0"/>
               <w:right w:val="single" w:color="auto" w:sz="4" w:space="0"/>
             </w:tcBorders>
-            <w:shd w:val="clear"/>
+            <w:shd w:val="clear" w:color="auto" w:fill="auto"/>
             <w:noWrap/>
             <w:vAlign w:val="center"/>
           </w:tcPr>
@@ -760,6 +759,7 @@
             <w:insideH w:val="none" w:color="auto" w:sz="0" w:space="0"/>
             <w:insideV w:val="none" w:color="auto" w:sz="0" w:space="0"/>
           </w:tblBorders>
+          <w:shd w:val="clear" w:color="auto" w:fill="auto"/>
           <w:tblCellMar>
             <w:top w:w="0" w:type="dxa"/>
             <w:left w:w="108" w:type="dxa"/>
@@ -779,7 +779,7 @@
               <w:bottom w:val="single" w:color="auto" w:sz="4" w:space="0"/>
               <w:right w:val="single" w:color="auto" w:sz="4" w:space="0"/>
             </w:tcBorders>
-            <w:shd w:val="clear"/>
+            <w:shd w:val="clear" w:color="auto" w:fill="auto"/>
             <w:noWrap/>
             <w:vAlign w:val="center"/>
           </w:tcPr>
@@ -811,7 +811,7 @@
               <w:bottom w:val="single" w:color="auto" w:sz="4" w:space="0"/>
               <w:right w:val="single" w:color="auto" w:sz="4" w:space="0"/>
             </w:tcBorders>
-            <w:shd w:val="clear"/>
+            <w:shd w:val="clear" w:color="auto" w:fill="auto"/>
             <w:noWrap/>
             <w:vAlign w:val="center"/>
           </w:tcPr>
@@ -841,7 +841,7 @@
             <w:insideH w:val="none" w:color="auto" w:sz="0" w:space="0"/>
             <w:insideV w:val="none" w:color="auto" w:sz="0" w:space="0"/>
           </w:tblBorders>
-          <w:shd w:val="clear"/>
+          <w:shd w:val="clear" w:color="auto" w:fill="auto"/>
           <w:tblCellMar>
             <w:top w:w="0" w:type="dxa"/>
             <w:left w:w="108" w:type="dxa"/>
@@ -861,7 +861,7 @@
               <w:bottom w:val="single" w:color="auto" w:sz="4" w:space="0"/>
               <w:right w:val="single" w:color="auto" w:sz="4" w:space="0"/>
             </w:tcBorders>
-            <w:shd w:val="clear"/>
+            <w:shd w:val="clear" w:color="auto" w:fill="auto"/>
             <w:noWrap/>
             <w:vAlign w:val="center"/>
           </w:tcPr>
@@ -893,7 +893,7 @@
               <w:bottom w:val="single" w:color="auto" w:sz="4" w:space="0"/>
               <w:right w:val="single" w:color="auto" w:sz="4" w:space="0"/>
             </w:tcBorders>
-            <w:shd w:val="clear"/>
+            <w:shd w:val="clear" w:color="auto" w:fill="auto"/>
             <w:noWrap/>
             <w:vAlign w:val="center"/>
           </w:tcPr>
@@ -923,215 +923,7 @@
             <w:insideH w:val="none" w:color="auto" w:sz="0" w:space="0"/>
             <w:insideV w:val="none" w:color="auto" w:sz="0" w:space="0"/>
           </w:tblBorders>
-          <w:shd w:val="clear"/>
-        </w:tblPrEx>
-        <w:trPr>
-          <w:trHeight w:val="270" w:hRule="atLeast"/>
-        </w:trPr>
-        <w:tc>
-          <w:tcPr>
-            <w:tcW w:w="0" w:type="auto"/>
-            <w:tcBorders>
-              <w:top w:val="nil"/>
-              <w:left w:val="single" w:color="auto" w:sz="4" w:space="0"/>
-              <w:bottom w:val="single" w:color="auto" w:sz="4" w:space="0"/>
-              <w:right w:val="single" w:color="auto" w:sz="4" w:space="0"/>
-            </w:tcBorders>
-            <w:shd w:val="clear"/>
-            <w:noWrap/>
-            <w:vAlign w:val="center"/>
-          </w:tcPr>
-          <w:p>
-            <w:pPr>
-              <w:rPr>
-                <w:rFonts w:hint="eastAsia"/>
-                <w:b/>
-                <w:bCs/>
-              </w:rPr>
-            </w:pPr>
-            <w:r>
-              <w:rPr>
-                <w:rFonts w:hint="eastAsia"/>
-                <w:b/>
-                <w:bCs/>
-                <w:lang w:val="en-US" w:eastAsia="zh-CN"/>
-              </w:rPr>
-              <w:t>Pixels</w:t>
-            </w:r>
-          </w:p>
-        </w:tc>
-        <w:tc>
-          <w:tcPr>
-            <w:tcW w:w="0" w:type="auto"/>
-            <w:tcBorders>
-              <w:top w:val="nil"/>
-              <w:left w:val="nil"/>
-              <w:bottom w:val="single" w:color="auto" w:sz="4" w:space="0"/>
-              <w:right w:val="single" w:color="auto" w:sz="4" w:space="0"/>
-            </w:tcBorders>
-            <w:shd w:val="clear"/>
-            <w:noWrap/>
-            <w:vAlign w:val="center"/>
-          </w:tcPr>
-          <w:p>
-            <w:pPr>
-              <w:rPr>
-                <w:rFonts w:hint="eastAsia"/>
-              </w:rPr>
-            </w:pPr>
-            <w:r>
-              <w:rPr>
-                <w:rFonts w:hint="eastAsia"/>
-                <w:lang w:val="en-US" w:eastAsia="zh-CN"/>
-              </w:rPr>
-              <w:t>0.3M</w:t>
-            </w:r>
-          </w:p>
-        </w:tc>
-      </w:tr>
-      <w:tr>
-        <w:tblPrEx>
-          <w:tblBorders>
-            <w:top w:val="none" w:color="auto" w:sz="0" w:space="0"/>
-            <w:left w:val="none" w:color="auto" w:sz="0" w:space="0"/>
-            <w:bottom w:val="none" w:color="auto" w:sz="0" w:space="0"/>
-            <w:right w:val="none" w:color="auto" w:sz="0" w:space="0"/>
-            <w:insideH w:val="none" w:color="auto" w:sz="0" w:space="0"/>
-            <w:insideV w:val="none" w:color="auto" w:sz="0" w:space="0"/>
-          </w:tblBorders>
-          <w:shd w:val="clear"/>
-        </w:tblPrEx>
-        <w:trPr>
-          <w:trHeight w:val="3780" w:hRule="atLeast"/>
-        </w:trPr>
-        <w:tc>
-          <w:tcPr>
-            <w:tcW w:w="0" w:type="auto"/>
-            <w:tcBorders>
-              <w:top w:val="nil"/>
-              <w:left w:val="single" w:color="auto" w:sz="4" w:space="0"/>
-              <w:bottom w:val="single" w:color="auto" w:sz="4" w:space="0"/>
-              <w:right w:val="single" w:color="auto" w:sz="4" w:space="0"/>
-            </w:tcBorders>
-            <w:shd w:val="clear"/>
-            <w:noWrap/>
-            <w:vAlign w:val="center"/>
-          </w:tcPr>
-          <w:p>
-            <w:pPr>
-              <w:rPr>
-                <w:rFonts w:hint="eastAsia"/>
-                <w:b/>
-                <w:bCs/>
-              </w:rPr>
-            </w:pPr>
-            <w:r>
-              <w:rPr>
-                <w:rFonts w:hint="eastAsia"/>
-                <w:b/>
-                <w:bCs/>
-                <w:lang w:val="en-US" w:eastAsia="zh-CN"/>
-              </w:rPr>
-              <w:t>Drvier Working Mode</w:t>
-            </w:r>
-          </w:p>
-        </w:tc>
-        <w:tc>
-          <w:tcPr>
-            <w:tcW w:w="3560" w:type="dxa"/>
-            <w:tcBorders>
-              <w:top w:val="nil"/>
-              <w:left w:val="nil"/>
-              <w:bottom w:val="single" w:color="auto" w:sz="4" w:space="0"/>
-              <w:right w:val="single" w:color="auto" w:sz="4" w:space="0"/>
-            </w:tcBorders>
-            <w:shd w:val="clear"/>
-            <w:vAlign w:val="center"/>
-          </w:tcPr>
-          <w:p>
-            <w:pPr>
-              <w:rPr>
-                <w:rFonts w:hint="eastAsia"/>
-              </w:rPr>
-            </w:pPr>
-            <w:r>
-              <w:rPr>
-                <w:rFonts w:hint="eastAsia"/>
-                <w:b/>
-                <w:bCs/>
-                <w:lang w:val="en-US" w:eastAsia="zh-CN"/>
-              </w:rPr>
-              <w:t>4 Working Mode</w:t>
-            </w:r>
-            <w:r>
-              <w:rPr>
-                <w:rFonts w:hint="eastAsia"/>
-                <w:lang w:val="en-US" w:eastAsia="zh-CN"/>
-              </w:rPr>
-              <w:br w:type="textWrapping"/>
-            </w:r>
-            <w:r>
-              <w:rPr>
-                <w:rFonts w:hint="eastAsia"/>
-                <w:lang w:val="en-US" w:eastAsia="zh-CN"/>
-              </w:rPr>
-              <w:t>0,8 bit stream mode</w:t>
-            </w:r>
-            <w:r>
-              <w:rPr>
-                <w:rFonts w:hint="eastAsia"/>
-                <w:lang w:val="en-US" w:eastAsia="zh-CN"/>
-              </w:rPr>
-              <w:br w:type="textWrapping"/>
-            </w:r>
-            <w:r>
-              <w:rPr>
-                <w:rFonts w:hint="eastAsia"/>
-                <w:lang w:val="en-US" w:eastAsia="zh-CN"/>
-              </w:rPr>
-              <w:t>1,10bit stream mode</w:t>
-            </w:r>
-            <w:r>
-              <w:rPr>
-                <w:rFonts w:hint="eastAsia"/>
-                <w:lang w:val="en-US" w:eastAsia="zh-CN"/>
-              </w:rPr>
-              <w:br w:type="textWrapping"/>
-            </w:r>
-            <w:r>
-              <w:rPr>
-                <w:rFonts w:hint="eastAsia"/>
-                <w:lang w:val="en-US" w:eastAsia="zh-CN"/>
-              </w:rPr>
-              <w:t>2,8bit external trigger mode</w:t>
-            </w:r>
-            <w:r>
-              <w:rPr>
-                <w:rFonts w:hint="eastAsia"/>
-                <w:lang w:val="en-US" w:eastAsia="zh-CN"/>
-              </w:rPr>
-              <w:br w:type="textWrapping"/>
-            </w:r>
-            <w:r>
-              <w:rPr>
-                <w:rFonts w:hint="eastAsia"/>
-                <w:lang w:val="en-US" w:eastAsia="zh-CN"/>
-              </w:rPr>
-              <w:t>3,10bit external trigger mode</w:t>
-            </w:r>
-          </w:p>
-        </w:tc>
-      </w:tr>
-      <w:tr>
-        <w:tblPrEx>
-          <w:tblBorders>
-            <w:top w:val="none" w:color="auto" w:sz="0" w:space="0"/>
-            <w:left w:val="none" w:color="auto" w:sz="0" w:space="0"/>
-            <w:bottom w:val="none" w:color="auto" w:sz="0" w:space="0"/>
-            <w:right w:val="none" w:color="auto" w:sz="0" w:space="0"/>
-            <w:insideH w:val="none" w:color="auto" w:sz="0" w:space="0"/>
-            <w:insideV w:val="none" w:color="auto" w:sz="0" w:space="0"/>
-          </w:tblBorders>
+          <w:shd w:val="clear" w:color="auto" w:fill="auto"/>
           <w:tblCellMar>
             <w:top w:w="0" w:type="dxa"/>
             <w:left w:w="108" w:type="dxa"/>
@@ -1151,7 +943,7 @@
               <w:bottom w:val="single" w:color="auto" w:sz="4" w:space="0"/>
               <w:right w:val="single" w:color="auto" w:sz="4" w:space="0"/>
             </w:tcBorders>
-            <w:shd w:val="clear"/>
+            <w:shd w:val="clear" w:color="auto" w:fill="auto"/>
             <w:noWrap/>
             <w:vAlign w:val="center"/>
           </w:tcPr>
@@ -1170,7 +962,7 @@
                 <w:bCs/>
                 <w:lang w:val="en-US" w:eastAsia="zh-CN"/>
               </w:rPr>
-              <w:t>Software Trigger</w:t>
+              <w:t>Pixels</w:t>
             </w:r>
           </w:p>
         </w:tc>
@@ -1183,7 +975,7 @@
               <w:bottom w:val="single" w:color="auto" w:sz="4" w:space="0"/>
               <w:right w:val="single" w:color="auto" w:sz="4" w:space="0"/>
             </w:tcBorders>
-            <w:shd w:val="clear"/>
+            <w:shd w:val="clear" w:color="auto" w:fill="auto"/>
             <w:noWrap/>
             <w:vAlign w:val="center"/>
           </w:tcPr>
@@ -1198,7 +990,7 @@
                 <w:rFonts w:hint="eastAsia"/>
                 <w:lang w:val="en-US" w:eastAsia="zh-CN"/>
               </w:rPr>
-              <w:t>Yes</w:t>
+              <w:t>0.3M</w:t>
             </w:r>
           </w:p>
         </w:tc>
@@ -1213,10 +1005,16 @@
             <w:insideH w:val="none" w:color="auto" w:sz="0" w:space="0"/>
             <w:insideV w:val="none" w:color="auto" w:sz="0" w:space="0"/>
           </w:tblBorders>
-          <w:shd w:val="clear"/>
+          <w:shd w:val="clear" w:color="auto" w:fill="auto"/>
+          <w:tblCellMar>
+            <w:top w:w="0" w:type="dxa"/>
+            <w:left w:w="108" w:type="dxa"/>
+            <w:bottom w:w="0" w:type="dxa"/>
+            <w:right w:w="108" w:type="dxa"/>
+          </w:tblCellMar>
         </w:tblPrEx>
         <w:trPr>
-          <w:trHeight w:val="270" w:hRule="atLeast"/>
+          <w:trHeight w:val="3780" w:hRule="atLeast"/>
         </w:trPr>
         <w:tc>
           <w:tcPr>
@@ -1227,7 +1025,7 @@
               <w:bottom w:val="single" w:color="auto" w:sz="4" w:space="0"/>
               <w:right w:val="single" w:color="auto" w:sz="4" w:space="0"/>
             </w:tcBorders>
-            <w:shd w:val="clear"/>
+            <w:shd w:val="clear" w:color="auto" w:fill="auto"/>
             <w:noWrap/>
             <w:vAlign w:val="center"/>
           </w:tcPr>
@@ -1246,21 +1044,20 @@
                 <w:bCs/>
                 <w:lang w:val="en-US" w:eastAsia="zh-CN"/>
               </w:rPr>
-              <w:t>Hardware Trigger</w:t>
+              <w:t>Drvier Working Mode</w:t>
             </w:r>
           </w:p>
         </w:tc>
         <w:tc>
           <w:tcPr>
-            <w:tcW w:w="0" w:type="auto"/>
+            <w:tcW w:w="3560" w:type="dxa"/>
             <w:tcBorders>
               <w:top w:val="nil"/>
               <w:left w:val="nil"/>
               <w:bottom w:val="single" w:color="auto" w:sz="4" w:space="0"/>
               <w:right w:val="single" w:color="auto" w:sz="4" w:space="0"/>
             </w:tcBorders>
-            <w:shd w:val="clear"/>
-            <w:noWrap/>
+            <w:shd w:val="clear" w:color="auto" w:fill="auto"/>
             <w:vAlign w:val="center"/>
           </w:tcPr>
           <w:p>
@@ -1272,9 +1069,67 @@
             <w:r>
               <w:rPr>
                 <w:rFonts w:hint="eastAsia"/>
+                <w:b/>
+                <w:bCs/>
                 <w:lang w:val="en-US" w:eastAsia="zh-CN"/>
               </w:rPr>
-              <w:t>Yes</w:t>
+              <w:t>4 Working Mode</w:t>
+            </w:r>
+            <w:r>
+              <w:rPr>
+                <w:rFonts w:hint="eastAsia"/>
+                <w:lang w:val="en-US" w:eastAsia="zh-CN"/>
+              </w:rPr>
+              <w:br w:type="textWrapping"/>
+            </w:r>
+            <w:r>
+              <w:rPr>
+                <w:rFonts w:hint="eastAsia"/>
+                <w:lang w:val="en-US" w:eastAsia="zh-CN"/>
+              </w:rPr>
+              <w:t>0,8 bit stream mode</w:t>
+            </w:r>
+            <w:r>
+              <w:rPr>
+                <w:rFonts w:hint="eastAsia"/>
+                <w:lang w:val="en-US" w:eastAsia="zh-CN"/>
+              </w:rPr>
+              <w:br w:type="textWrapping"/>
+            </w:r>
+            <w:r>
+              <w:rPr>
+                <w:rFonts w:hint="eastAsia"/>
+                <w:lang w:val="en-US" w:eastAsia="zh-CN"/>
+              </w:rPr>
+              <w:t>1,10bit stream mode</w:t>
+            </w:r>
+            <w:r>
+              <w:rPr>
+                <w:rFonts w:hint="eastAsia"/>
+                <w:lang w:val="en-US" w:eastAsia="zh-CN"/>
+              </w:rPr>
+              <w:br w:type="textWrapping"/>
+            </w:r>
+            <w:r>
+              <w:rPr>
+                <w:rFonts w:hint="eastAsia"/>
+                <w:lang w:val="en-US" w:eastAsia="zh-CN"/>
+              </w:rPr>
+              <w:t>2,8bit external trigger mode</w:t>
+            </w:r>
+            <w:r>
+              <w:rPr>
+                <w:rFonts w:hint="eastAsia"/>
+                <w:lang w:val="en-US" w:eastAsia="zh-CN"/>
+              </w:rPr>
+              <w:br w:type="textWrapping"/>
+            </w:r>
+            <w:r>
+              <w:rPr>
+                <w:rFonts w:hint="eastAsia"/>
+                <w:lang w:val="en-US" w:eastAsia="zh-CN"/>
+              </w:rPr>
+              <w:t>3,10bit external trigger mode</w:t>
             </w:r>
           </w:p>
         </w:tc>
@@ -1289,185 +1144,7 @@
             <w:insideH w:val="none" w:color="auto" w:sz="0" w:space="0"/>
             <w:insideV w:val="none" w:color="auto" w:sz="0" w:space="0"/>
           </w:tblBorders>
-        </w:tblPrEx>
-        <w:trPr>
-          <w:trHeight w:val="270" w:hRule="atLeast"/>
-        </w:trPr>
-        <w:tc>
-          <w:tcPr>
-            <w:tcW w:w="0" w:type="auto"/>
-            <w:tcBorders>
-              <w:top w:val="nil"/>
-              <w:left w:val="single" w:color="auto" w:sz="4" w:space="0"/>
-              <w:bottom w:val="single" w:color="auto" w:sz="4" w:space="0"/>
-              <w:right w:val="single" w:color="auto" w:sz="4" w:space="0"/>
-            </w:tcBorders>
-            <w:shd w:val="clear"/>
-            <w:noWrap/>
-            <w:vAlign w:val="center"/>
-          </w:tcPr>
-          <w:p>
-            <w:pPr>
-              <w:rPr>
-                <w:rFonts w:hint="eastAsia"/>
-                <w:b/>
-                <w:bCs/>
-              </w:rPr>
-            </w:pPr>
-            <w:r>
-              <w:rPr>
-                <w:rFonts w:hint="eastAsia"/>
-                <w:b/>
-                <w:bCs/>
-                <w:lang w:val="en-US" w:eastAsia="zh-CN"/>
-              </w:rPr>
-              <w:t>Global Shutter</w:t>
-            </w:r>
-          </w:p>
-        </w:tc>
-        <w:tc>
-          <w:tcPr>
-            <w:tcW w:w="0" w:type="auto"/>
-            <w:tcBorders>
-              <w:top w:val="nil"/>
-              <w:left w:val="nil"/>
-              <w:bottom w:val="single" w:color="auto" w:sz="4" w:space="0"/>
-              <w:right w:val="single" w:color="auto" w:sz="4" w:space="0"/>
-            </w:tcBorders>
-            <w:shd w:val="clear"/>
-            <w:noWrap/>
-            <w:vAlign w:val="center"/>
-          </w:tcPr>
-          <w:p>
-            <w:pPr>
-              <w:rPr>
-                <w:rFonts w:hint="eastAsia"/>
-              </w:rPr>
-            </w:pPr>
-            <w:r>
-              <w:rPr>
-                <w:rFonts w:hint="eastAsia"/>
-                <w:lang w:val="en-US" w:eastAsia="zh-CN"/>
-              </w:rPr>
-              <w:t>Yes</w:t>
-            </w:r>
-          </w:p>
-        </w:tc>
-      </w:tr>
-      <w:tr>
-        <w:tblPrEx>
-          <w:tblBorders>
-            <w:top w:val="none" w:color="auto" w:sz="0" w:space="0"/>
-            <w:left w:val="none" w:color="auto" w:sz="0" w:space="0"/>
-            <w:bottom w:val="none" w:color="auto" w:sz="0" w:space="0"/>
-            <w:right w:val="none" w:color="auto" w:sz="0" w:space="0"/>
-            <w:insideH w:val="none" w:color="auto" w:sz="0" w:space="0"/>
-            <w:insideV w:val="none" w:color="auto" w:sz="0" w:space="0"/>
-          </w:tblBorders>
-          <w:shd w:val="clear"/>
-        </w:tblPrEx>
-        <w:trPr>
-          <w:trHeight w:val="270" w:hRule="atLeast"/>
-        </w:trPr>
-        <w:tc>
-          <w:tcPr>
-            <w:tcW w:w="0" w:type="auto"/>
-            <w:tcBorders>
-              <w:top w:val="nil"/>
-              <w:left w:val="single" w:color="auto" w:sz="4" w:space="0"/>
-              <w:bottom w:val="single" w:color="auto" w:sz="4" w:space="0"/>
-              <w:right w:val="single" w:color="auto" w:sz="4" w:space="0"/>
-            </w:tcBorders>
-            <w:shd w:val="clear"/>
-            <w:noWrap/>
-            <w:vAlign w:val="center"/>
-          </w:tcPr>
-          <w:p>
-            <w:pPr>
-              <w:rPr>
-                <w:rFonts w:hint="eastAsia"/>
-                <w:b/>
-                <w:bCs/>
-              </w:rPr>
-            </w:pPr>
-            <w:r>
-              <w:rPr>
-                <w:rFonts w:hint="eastAsia"/>
-                <w:b/>
-                <w:bCs/>
-                <w:lang w:val="en-US" w:eastAsia="zh-CN"/>
-              </w:rPr>
-              <w:t>Source Code</w:t>
-            </w:r>
-          </w:p>
-        </w:tc>
-        <w:tc>
-          <w:tcPr>
-            <w:tcW w:w="0" w:type="auto"/>
-            <w:tcBorders>
-              <w:top w:val="nil"/>
-              <w:left w:val="nil"/>
-              <w:bottom w:val="nil"/>
-              <w:right w:val="nil"/>
-            </w:tcBorders>
-            <w:shd w:val="clear"/>
-            <w:noWrap/>
-            <w:vAlign w:val="center"/>
-          </w:tcPr>
-          <w:p>
-            <w:pPr>
-              <w:rPr>
-                <w:rFonts w:hint="eastAsia"/>
-              </w:rPr>
-            </w:pPr>
-            <w:r>
-              <w:rPr>
-                <w:rFonts w:hint="eastAsia"/>
-                <w:lang w:val="en-US" w:eastAsia="zh-CN"/>
-              </w:rPr>
-              <w:fldChar w:fldCharType="begin"/>
-            </w:r>
-            <w:r>
-              <w:rPr>
-                <w:rFonts w:hint="eastAsia"/>
-                <w:lang w:val="en-US" w:eastAsia="zh-CN"/>
-              </w:rPr>
-              <w:instrText xml:space="preserve"> HYPERLINK "https://github.com/INNO-MAKER/cam-mipiov7251-trigger" </w:instrText>
-            </w:r>
-            <w:r>
-              <w:rPr>
-                <w:rFonts w:hint="eastAsia"/>
-                <w:lang w:val="en-US" w:eastAsia="zh-CN"/>
-              </w:rPr>
-              <w:fldChar w:fldCharType="separate"/>
-            </w:r>
-            <w:r>
-              <w:rPr>
-                <w:rFonts w:hint="eastAsia"/>
-              </w:rPr>
-              <w:t>vc_mipi_ov7251_driver_pi_lattice_linux5.15.tar.gz</w:t>
-            </w:r>
-            <w:r>
-              <w:rPr>
-                <w:rFonts w:hint="eastAsia"/>
-                <w:lang w:val="en-US" w:eastAsia="zh-CN"/>
-              </w:rPr>
-              <w:fldChar w:fldCharType="end"/>
-            </w:r>
-          </w:p>
-        </w:tc>
-      </w:tr>
-      <w:tr>
-        <w:tblPrEx>
-          <w:tblBorders>
-            <w:top w:val="none" w:color="auto" w:sz="0" w:space="0"/>
-            <w:left w:val="none" w:color="auto" w:sz="0" w:space="0"/>
-            <w:bottom w:val="none" w:color="auto" w:sz="0" w:space="0"/>
-            <w:right w:val="none" w:color="auto" w:sz="0" w:space="0"/>
-            <w:insideH w:val="none" w:color="auto" w:sz="0" w:space="0"/>
-            <w:insideV w:val="none" w:color="auto" w:sz="0" w:space="0"/>
-          </w:tblBorders>
-          <w:shd w:val="clear"/>
+          <w:shd w:val="clear" w:color="auto" w:fill="auto"/>
           <w:tblCellMar>
             <w:top w:w="0" w:type="dxa"/>
             <w:left w:w="108" w:type="dxa"/>
@@ -1487,7 +1164,362 @@
               <w:bottom w:val="single" w:color="auto" w:sz="4" w:space="0"/>
               <w:right w:val="single" w:color="auto" w:sz="4" w:space="0"/>
             </w:tcBorders>
-            <w:shd w:val="clear"/>
+            <w:shd w:val="clear" w:color="auto" w:fill="auto"/>
+            <w:noWrap/>
+            <w:vAlign w:val="center"/>
+          </w:tcPr>
+          <w:p>
+            <w:pPr>
+              <w:rPr>
+                <w:rFonts w:hint="eastAsia"/>
+                <w:b/>
+                <w:bCs/>
+              </w:rPr>
+            </w:pPr>
+            <w:r>
+              <w:rPr>
+                <w:rFonts w:hint="eastAsia"/>
+                <w:b/>
+                <w:bCs/>
+                <w:lang w:val="en-US" w:eastAsia="zh-CN"/>
+              </w:rPr>
+              <w:t>Software Trigger</w:t>
+            </w:r>
+          </w:p>
+        </w:tc>
+        <w:tc>
+          <w:tcPr>
+            <w:tcW w:w="0" w:type="auto"/>
+            <w:tcBorders>
+              <w:top w:val="nil"/>
+              <w:left w:val="nil"/>
+              <w:bottom w:val="single" w:color="auto" w:sz="4" w:space="0"/>
+              <w:right w:val="single" w:color="auto" w:sz="4" w:space="0"/>
+            </w:tcBorders>
+            <w:shd w:val="clear" w:color="auto" w:fill="auto"/>
+            <w:noWrap/>
+            <w:vAlign w:val="center"/>
+          </w:tcPr>
+          <w:p>
+            <w:pPr>
+              <w:rPr>
+                <w:rFonts w:hint="eastAsia"/>
+              </w:rPr>
+            </w:pPr>
+            <w:r>
+              <w:rPr>
+                <w:rFonts w:hint="eastAsia"/>
+                <w:lang w:val="en-US" w:eastAsia="zh-CN"/>
+              </w:rPr>
+              <w:t>Yes</w:t>
+            </w:r>
+          </w:p>
+        </w:tc>
+      </w:tr>
+      <w:tr>
+        <w:tblPrEx>
+          <w:tblBorders>
+            <w:top w:val="none" w:color="auto" w:sz="0" w:space="0"/>
+            <w:left w:val="none" w:color="auto" w:sz="0" w:space="0"/>
+            <w:bottom w:val="none" w:color="auto" w:sz="0" w:space="0"/>
+            <w:right w:val="none" w:color="auto" w:sz="0" w:space="0"/>
+            <w:insideH w:val="none" w:color="auto" w:sz="0" w:space="0"/>
+            <w:insideV w:val="none" w:color="auto" w:sz="0" w:space="0"/>
+          </w:tblBorders>
+          <w:shd w:val="clear" w:color="auto" w:fill="auto"/>
+          <w:tblCellMar>
+            <w:top w:w="0" w:type="dxa"/>
+            <w:left w:w="108" w:type="dxa"/>
+            <w:bottom w:w="0" w:type="dxa"/>
+            <w:right w:w="108" w:type="dxa"/>
+          </w:tblCellMar>
+        </w:tblPrEx>
+        <w:trPr>
+          <w:trHeight w:val="270" w:hRule="atLeast"/>
+        </w:trPr>
+        <w:tc>
+          <w:tcPr>
+            <w:tcW w:w="0" w:type="auto"/>
+            <w:tcBorders>
+              <w:top w:val="nil"/>
+              <w:left w:val="single" w:color="auto" w:sz="4" w:space="0"/>
+              <w:bottom w:val="single" w:color="auto" w:sz="4" w:space="0"/>
+              <w:right w:val="single" w:color="auto" w:sz="4" w:space="0"/>
+            </w:tcBorders>
+            <w:shd w:val="clear" w:color="auto" w:fill="auto"/>
+            <w:noWrap/>
+            <w:vAlign w:val="center"/>
+          </w:tcPr>
+          <w:p>
+            <w:pPr>
+              <w:rPr>
+                <w:rFonts w:hint="eastAsia"/>
+                <w:b/>
+                <w:bCs/>
+              </w:rPr>
+            </w:pPr>
+            <w:r>
+              <w:rPr>
+                <w:rFonts w:hint="eastAsia"/>
+                <w:b/>
+                <w:bCs/>
+                <w:lang w:val="en-US" w:eastAsia="zh-CN"/>
+              </w:rPr>
+              <w:t>Hardware Trigger</w:t>
+            </w:r>
+          </w:p>
+        </w:tc>
+        <w:tc>
+          <w:tcPr>
+            <w:tcW w:w="0" w:type="auto"/>
+            <w:tcBorders>
+              <w:top w:val="nil"/>
+              <w:left w:val="nil"/>
+              <w:bottom w:val="single" w:color="auto" w:sz="4" w:space="0"/>
+              <w:right w:val="single" w:color="auto" w:sz="4" w:space="0"/>
+            </w:tcBorders>
+            <w:shd w:val="clear" w:color="auto" w:fill="auto"/>
+            <w:noWrap/>
+            <w:vAlign w:val="center"/>
+          </w:tcPr>
+          <w:p>
+            <w:pPr>
+              <w:rPr>
+                <w:rFonts w:hint="eastAsia"/>
+              </w:rPr>
+            </w:pPr>
+            <w:r>
+              <w:rPr>
+                <w:rFonts w:hint="eastAsia"/>
+                <w:lang w:val="en-US" w:eastAsia="zh-CN"/>
+              </w:rPr>
+              <w:t>Yes</w:t>
+            </w:r>
+          </w:p>
+        </w:tc>
+      </w:tr>
+      <w:tr>
+        <w:tblPrEx>
+          <w:tblBorders>
+            <w:top w:val="none" w:color="auto" w:sz="0" w:space="0"/>
+            <w:left w:val="none" w:color="auto" w:sz="0" w:space="0"/>
+            <w:bottom w:val="none" w:color="auto" w:sz="0" w:space="0"/>
+            <w:right w:val="none" w:color="auto" w:sz="0" w:space="0"/>
+            <w:insideH w:val="none" w:color="auto" w:sz="0" w:space="0"/>
+            <w:insideV w:val="none" w:color="auto" w:sz="0" w:space="0"/>
+          </w:tblBorders>
+          <w:shd w:val="clear" w:color="auto" w:fill="auto"/>
+          <w:tblCellMar>
+            <w:top w:w="0" w:type="dxa"/>
+            <w:left w:w="108" w:type="dxa"/>
+            <w:bottom w:w="0" w:type="dxa"/>
+            <w:right w:w="108" w:type="dxa"/>
+          </w:tblCellMar>
+        </w:tblPrEx>
+        <w:trPr>
+          <w:trHeight w:val="270" w:hRule="atLeast"/>
+        </w:trPr>
+        <w:tc>
+          <w:tcPr>
+            <w:tcW w:w="0" w:type="auto"/>
+            <w:tcBorders>
+              <w:top w:val="nil"/>
+              <w:left w:val="single" w:color="auto" w:sz="4" w:space="0"/>
+              <w:bottom w:val="single" w:color="auto" w:sz="4" w:space="0"/>
+              <w:right w:val="single" w:color="auto" w:sz="4" w:space="0"/>
+            </w:tcBorders>
+            <w:shd w:val="clear" w:color="auto" w:fill="auto"/>
+            <w:noWrap/>
+            <w:vAlign w:val="center"/>
+          </w:tcPr>
+          <w:p>
+            <w:pPr>
+              <w:rPr>
+                <w:rFonts w:hint="eastAsia"/>
+                <w:b/>
+                <w:bCs/>
+              </w:rPr>
+            </w:pPr>
+            <w:r>
+              <w:rPr>
+                <w:rFonts w:hint="eastAsia"/>
+                <w:b/>
+                <w:bCs/>
+                <w:lang w:val="en-US" w:eastAsia="zh-CN"/>
+              </w:rPr>
+              <w:t>Global Shutter</w:t>
+            </w:r>
+          </w:p>
+        </w:tc>
+        <w:tc>
+          <w:tcPr>
+            <w:tcW w:w="0" w:type="auto"/>
+            <w:tcBorders>
+              <w:top w:val="nil"/>
+              <w:left w:val="nil"/>
+              <w:bottom w:val="single" w:color="auto" w:sz="4" w:space="0"/>
+              <w:right w:val="single" w:color="auto" w:sz="4" w:space="0"/>
+            </w:tcBorders>
+            <w:shd w:val="clear" w:color="auto" w:fill="auto"/>
+            <w:noWrap/>
+            <w:vAlign w:val="center"/>
+          </w:tcPr>
+          <w:p>
+            <w:pPr>
+              <w:rPr>
+                <w:rFonts w:hint="eastAsia"/>
+              </w:rPr>
+            </w:pPr>
+            <w:r>
+              <w:rPr>
+                <w:rFonts w:hint="eastAsia"/>
+                <w:lang w:val="en-US" w:eastAsia="zh-CN"/>
+              </w:rPr>
+              <w:t>Yes</w:t>
+            </w:r>
+          </w:p>
+        </w:tc>
+      </w:tr>
+      <w:tr>
+        <w:tblPrEx>
+          <w:tblBorders>
+            <w:top w:val="none" w:color="auto" w:sz="0" w:space="0"/>
+            <w:left w:val="none" w:color="auto" w:sz="0" w:space="0"/>
+            <w:bottom w:val="none" w:color="auto" w:sz="0" w:space="0"/>
+            <w:right w:val="none" w:color="auto" w:sz="0" w:space="0"/>
+            <w:insideH w:val="none" w:color="auto" w:sz="0" w:space="0"/>
+            <w:insideV w:val="none" w:color="auto" w:sz="0" w:space="0"/>
+          </w:tblBorders>
+          <w:shd w:val="clear" w:color="auto" w:fill="auto"/>
+          <w:tblCellMar>
+            <w:top w:w="0" w:type="dxa"/>
+            <w:left w:w="108" w:type="dxa"/>
+            <w:bottom w:w="0" w:type="dxa"/>
+            <w:right w:w="108" w:type="dxa"/>
+          </w:tblCellMar>
+        </w:tblPrEx>
+        <w:trPr>
+          <w:trHeight w:val="270" w:hRule="atLeast"/>
+        </w:trPr>
+        <w:tc>
+          <w:tcPr>
+            <w:tcW w:w="0" w:type="auto"/>
+            <w:tcBorders>
+              <w:top w:val="nil"/>
+              <w:left w:val="single" w:color="auto" w:sz="4" w:space="0"/>
+              <w:bottom w:val="single" w:color="auto" w:sz="4" w:space="0"/>
+              <w:right w:val="single" w:color="auto" w:sz="4" w:space="0"/>
+            </w:tcBorders>
+            <w:shd w:val="clear" w:color="auto" w:fill="auto"/>
+            <w:noWrap/>
+            <w:vAlign w:val="center"/>
+          </w:tcPr>
+          <w:p>
+            <w:pPr>
+              <w:rPr>
+                <w:rFonts w:hint="eastAsia"/>
+                <w:b/>
+                <w:bCs/>
+              </w:rPr>
+            </w:pPr>
+            <w:r>
+              <w:rPr>
+                <w:rFonts w:hint="eastAsia"/>
+                <w:b/>
+                <w:bCs/>
+                <w:lang w:val="en-US" w:eastAsia="zh-CN"/>
+              </w:rPr>
+              <w:t>Source Code</w:t>
+            </w:r>
+          </w:p>
+        </w:tc>
+        <w:tc>
+          <w:tcPr>
+            <w:tcW w:w="0" w:type="auto"/>
+            <w:tcBorders>
+              <w:top w:val="nil"/>
+              <w:left w:val="nil"/>
+              <w:bottom w:val="nil"/>
+              <w:right w:val="nil"/>
+            </w:tcBorders>
+            <w:shd w:val="clear" w:color="auto" w:fill="auto"/>
+            <w:noWrap/>
+            <w:vAlign w:val="center"/>
+          </w:tcPr>
+          <w:p>
+            <w:pPr>
+              <w:rPr>
+                <w:rFonts w:hint="eastAsia"/>
+              </w:rPr>
+            </w:pPr>
+            <w:r>
+              <w:rPr>
+                <w:rFonts w:hint="eastAsia"/>
+                <w:lang w:val="en-US" w:eastAsia="zh-CN"/>
+              </w:rPr>
+              <w:fldChar w:fldCharType="begin"/>
+            </w:r>
+            <w:r>
+              <w:rPr>
+                <w:rFonts w:hint="eastAsia"/>
+                <w:lang w:val="en-US" w:eastAsia="zh-CN"/>
+              </w:rPr>
+              <w:instrText xml:space="preserve"> HYPERLINK "https://github.com/INNO-MAKER/cam-mipiov7251-trigger" </w:instrText>
+            </w:r>
+            <w:r>
+              <w:rPr>
+                <w:rFonts w:hint="eastAsia"/>
+                <w:lang w:val="en-US" w:eastAsia="zh-CN"/>
+              </w:rPr>
+              <w:fldChar w:fldCharType="separate"/>
+            </w:r>
+            <w:r>
+              <w:rPr>
+                <w:rFonts w:hint="eastAsia"/>
+              </w:rPr>
+              <w:t>vc_mipi_ov7251_driver_pi_lattice_linux5.15.tar.gz</w:t>
+            </w:r>
+            <w:r>
+              <w:rPr>
+                <w:rFonts w:hint="eastAsia"/>
+                <w:lang w:val="en-US" w:eastAsia="zh-CN"/>
+              </w:rPr>
+              <w:fldChar w:fldCharType="end"/>
+            </w:r>
+          </w:p>
+        </w:tc>
+      </w:tr>
+      <w:tr>
+        <w:tblPrEx>
+          <w:tblBorders>
+            <w:top w:val="none" w:color="auto" w:sz="0" w:space="0"/>
+            <w:left w:val="none" w:color="auto" w:sz="0" w:space="0"/>
+            <w:bottom w:val="none" w:color="auto" w:sz="0" w:space="0"/>
+            <w:right w:val="none" w:color="auto" w:sz="0" w:space="0"/>
+            <w:insideH w:val="none" w:color="auto" w:sz="0" w:space="0"/>
+            <w:insideV w:val="none" w:color="auto" w:sz="0" w:space="0"/>
+          </w:tblBorders>
+          <w:shd w:val="clear" w:color="auto" w:fill="auto"/>
+          <w:tblCellMar>
+            <w:top w:w="0" w:type="dxa"/>
+            <w:left w:w="108" w:type="dxa"/>
+            <w:bottom w:w="0" w:type="dxa"/>
+            <w:right w:w="108" w:type="dxa"/>
+          </w:tblCellMar>
+        </w:tblPrEx>
+        <w:trPr>
+          <w:trHeight w:val="270" w:hRule="atLeast"/>
+        </w:trPr>
+        <w:tc>
+          <w:tcPr>
+            <w:tcW w:w="0" w:type="auto"/>
+            <w:tcBorders>
+              <w:top w:val="nil"/>
+              <w:left w:val="single" w:color="auto" w:sz="4" w:space="0"/>
+              <w:bottom w:val="single" w:color="auto" w:sz="4" w:space="0"/>
+              <w:right w:val="single" w:color="auto" w:sz="4" w:space="0"/>
+            </w:tcBorders>
+            <w:shd w:val="clear" w:color="auto" w:fill="auto"/>
             <w:noWrap/>
             <w:vAlign w:val="center"/>
           </w:tcPr>
@@ -1519,7 +1551,7 @@
               <w:bottom w:val="single" w:color="auto" w:sz="4" w:space="0"/>
               <w:right w:val="single" w:color="auto" w:sz="4" w:space="0"/>
             </w:tcBorders>
-            <w:shd w:val="clear"/>
+            <w:shd w:val="clear" w:color="auto" w:fill="auto"/>
             <w:noWrap/>
             <w:vAlign w:val="center"/>
           </w:tcPr>
@@ -2874,6 +2906,80 @@
       </w:r>
       <w:r>
         <w:t>:</w:t>
+      </w:r>
+    </w:p>
+    <w:tbl>
+      <w:tblPr>
+        <w:tblStyle w:val="11"/>
+        <w:tblW w:w="0" w:type="auto"/>
+        <w:tblInd w:w="0" w:type="dxa"/>
+        <w:tblBorders>
+          <w:top w:val="single" w:color="auto" w:sz="4" w:space="0"/>
+          <w:left w:val="single" w:color="auto" w:sz="4" w:space="0"/>
+          <w:bottom w:val="single" w:color="auto" w:sz="4" w:space="0"/>
+          <w:right w:val="single" w:color="auto" w:sz="4" w:space="0"/>
+          <w:insideH w:val="single" w:color="auto" w:sz="4" w:space="0"/>
+          <w:insideV w:val="single" w:color="auto" w:sz="4" w:space="0"/>
+        </w:tblBorders>
+        <w:tblLayout w:type="autofit"/>
+        <w:tblCellMar>
+          <w:top w:w="0" w:type="dxa"/>
+          <w:left w:w="108" w:type="dxa"/>
+          <w:bottom w:w="0" w:type="dxa"/>
+          <w:right w:w="108" w:type="dxa"/>
+        </w:tblCellMar>
+      </w:tblPr>
+      <w:tblGrid>
+        <w:gridCol w:w="8522"/>
+      </w:tblGrid>
+      <w:tr>
+        <w:tblPrEx>
+          <w:tblBorders>
+            <w:top w:val="single" w:color="auto" w:sz="4" w:space="0"/>
+            <w:left w:val="single" w:color="auto" w:sz="4" w:space="0"/>
+            <w:bottom w:val="single" w:color="auto" w:sz="4" w:space="0"/>
+            <w:right w:val="single" w:color="auto" w:sz="4" w:space="0"/>
+            <w:insideH w:val="single" w:color="auto" w:sz="4" w:space="0"/>
+            <w:insideV w:val="single" w:color="auto" w:sz="4" w:space="0"/>
+          </w:tblBorders>
+        </w:tblPrEx>
+        <w:tc>
+          <w:tcPr>
+            <w:tcW w:w="8522" w:type="dxa"/>
+            <w:shd w:val="clear" w:color="auto" w:fill="80C588" w:themeFill="background1" w:themeFillShade="BF"/>
+          </w:tcPr>
+          <w:p>
+            <w:r>
+              <w:rPr>
+                <w:rFonts w:hint="eastAsia"/>
+              </w:rPr>
+              <w:t>$sudo git clone https://github.com/INNO-MAKER/cam-mipiov7251-trigger.git</w:t>
+            </w:r>
+          </w:p>
+        </w:tc>
+      </w:tr>
+    </w:tbl>
+    <w:p>
+      <w:r>
+        <w:t>Step</w:t>
+      </w:r>
+      <w:r>
+        <w:rPr>
+          <w:rFonts w:hint="eastAsia"/>
+        </w:rPr>
+        <w:t>2</w:t>
+      </w:r>
+      <w:r>
+        <w:t xml:space="preserve"> </w:t>
+      </w:r>
+      <w:r>
+        <w:rPr>
+          <w:rFonts w:hint="eastAsia"/>
+        </w:rPr>
+        <w:t>,</w:t>
+      </w:r>
+      <w:r>
+        <w:t>Install the linux kernel header by:</w:t>
       </w:r>
     </w:p>
     <w:tbl>
@@ -2920,87 +3026,7 @@
         <w:tc>
           <w:tcPr>
             <w:tcW w:w="8522" w:type="dxa"/>
-            <w:shd w:val="clear" w:color="auto" w:fill="BEBEBE" w:themeFill="background1" w:themeFillShade="BF"/>
-          </w:tcPr>
-          <w:p>
-            <w:r>
-              <w:rPr>
-                <w:rFonts w:hint="eastAsia"/>
-              </w:rPr>
-              <w:t>$sudo git clone https://github.com/INNO-MAKER/cam-mipiov7251-trigger.git</w:t>
-            </w:r>
-          </w:p>
-        </w:tc>
-      </w:tr>
-    </w:tbl>
-    <w:p>
-      <w:r>
-        <w:t>Step</w:t>
-      </w:r>
-      <w:r>
-        <w:rPr>
-          <w:rFonts w:hint="eastAsia"/>
-        </w:rPr>
-        <w:t>2</w:t>
-      </w:r>
-      <w:r>
-        <w:t xml:space="preserve"> </w:t>
-      </w:r>
-      <w:r>
-        <w:rPr>
-          <w:rFonts w:hint="eastAsia"/>
-        </w:rPr>
-        <w:t>,</w:t>
-      </w:r>
-      <w:r>
-        <w:t>Install the linux kernel header by:</w:t>
-      </w:r>
-    </w:p>
-    <w:tbl>
-      <w:tblPr>
-        <w:tblStyle w:val="11"/>
-        <w:tblW w:w="0" w:type="auto"/>
-        <w:tblInd w:w="0" w:type="dxa"/>
-        <w:tblBorders>
-          <w:top w:val="single" w:color="auto" w:sz="4" w:space="0"/>
-          <w:left w:val="single" w:color="auto" w:sz="4" w:space="0"/>
-          <w:bottom w:val="single" w:color="auto" w:sz="4" w:space="0"/>
-          <w:right w:val="single" w:color="auto" w:sz="4" w:space="0"/>
-          <w:insideH w:val="single" w:color="auto" w:sz="4" w:space="0"/>
-          <w:insideV w:val="single" w:color="auto" w:sz="4" w:space="0"/>
-        </w:tblBorders>
-        <w:tblLayout w:type="autofit"/>
-        <w:tblCellMar>
-          <w:top w:w="0" w:type="dxa"/>
-          <w:left w:w="108" w:type="dxa"/>
-          <w:bottom w:w="0" w:type="dxa"/>
-          <w:right w:w="108" w:type="dxa"/>
-        </w:tblCellMar>
-      </w:tblPr>
-      <w:tblGrid>
-        <w:gridCol w:w="8522"/>
-      </w:tblGrid>
-      <w:tr>
-        <w:tblPrEx>
-          <w:tblBorders>
-            <w:top w:val="single" w:color="auto" w:sz="4" w:space="0"/>
-            <w:left w:val="single" w:color="auto" w:sz="4" w:space="0"/>
-            <w:bottom w:val="single" w:color="auto" w:sz="4" w:space="0"/>
-            <w:right w:val="single" w:color="auto" w:sz="4" w:space="0"/>
-            <w:insideH w:val="single" w:color="auto" w:sz="4" w:space="0"/>
-            <w:insideV w:val="single" w:color="auto" w:sz="4" w:space="0"/>
-          </w:tblBorders>
-          <w:tblCellMar>
-            <w:top w:w="0" w:type="dxa"/>
-            <w:left w:w="108" w:type="dxa"/>
-            <w:bottom w:w="0" w:type="dxa"/>
-            <w:right w:w="108" w:type="dxa"/>
-          </w:tblCellMar>
-        </w:tblPrEx>
-        <w:tc>
-          <w:tcPr>
-            <w:tcW w:w="8522" w:type="dxa"/>
-            <w:shd w:val="clear" w:color="auto" w:fill="BEBEBE" w:themeFill="background1" w:themeFillShade="BF"/>
+            <w:shd w:val="clear" w:color="auto" w:fill="80C588" w:themeFill="background1" w:themeFillShade="BF"/>
           </w:tcPr>
           <w:p>
             <w:pPr>
@@ -3205,7 +3231,7 @@
               <w:tc>
                 <w:tcPr>
                   <w:tcW w:w="8070" w:type="dxa"/>
-                  <w:shd w:val="clear" w:color="auto" w:fill="A5A5A5" w:themeFill="background1" w:themeFillShade="A6"/>
+                  <w:shd w:val="clear" w:color="auto" w:fill="63B86C" w:themeFill="background1" w:themeFillShade="A6"/>
                 </w:tcPr>
                 <w:p>
                   <w:pPr>
@@ -3309,7 +3335,7 @@
               <w:tc>
                 <w:tcPr>
                   <w:tcW w:w="8522" w:type="dxa"/>
-                  <w:shd w:val="clear" w:color="auto" w:fill="A4A4A4" w:themeFill="background1" w:themeFillShade="A5"/>
+                  <w:shd w:val="clear" w:color="auto" w:fill="61B86B" w:themeFill="background1" w:themeFillShade="A5"/>
                 </w:tcPr>
                 <w:p>
                   <w:pPr>
@@ -3407,7 +3433,7 @@
         <w:tc>
           <w:tcPr>
             <w:tcW w:w="8522" w:type="dxa"/>
-            <w:shd w:val="clear" w:color="auto" w:fill="BEBEBE" w:themeFill="background1" w:themeFillShade="BF"/>
+            <w:shd w:val="clear" w:color="auto" w:fill="80C588" w:themeFill="background1" w:themeFillShade="BF"/>
           </w:tcPr>
           <w:p>
             <w:r>
@@ -3514,7 +3540,7 @@
         <w:tc>
           <w:tcPr>
             <w:tcW w:w="8522" w:type="dxa"/>
-            <w:shd w:val="clear" w:color="auto" w:fill="BEBEBE" w:themeFill="background1" w:themeFillShade="BF"/>
+            <w:shd w:val="clear" w:color="auto" w:fill="80C588" w:themeFill="background1" w:themeFillShade="BF"/>
           </w:tcPr>
           <w:p>
             <w:r>
@@ -3577,7 +3603,7 @@
           <w:insideH w:val="single" w:color="auto" w:sz="4" w:space="0"/>
           <w:insideV w:val="single" w:color="auto" w:sz="4" w:space="0"/>
         </w:tblBorders>
-        <w:shd w:val="clear" w:color="auto" w:fill="D7D7D7" w:themeFill="background1" w:themeFillShade="D8"/>
+        <w:shd w:val="clear" w:color="auto" w:fill="9ED3A3" w:themeFill="background1" w:themeFillShade="D8"/>
         <w:tblLayout w:type="autofit"/>
         <w:tblCellMar>
           <w:top w:w="0" w:type="dxa"/>
@@ -3599,6 +3625,7 @@
             <w:insideH w:val="single" w:color="auto" w:sz="4" w:space="0"/>
             <w:insideV w:val="single" w:color="auto" w:sz="4" w:space="0"/>
           </w:tblBorders>
+          <w:shd w:val="clear" w:color="auto" w:fill="9ED3A3" w:themeFill="background1" w:themeFillShade="D8"/>
           <w:tblCellMar>
             <w:top w:w="0" w:type="dxa"/>
             <w:left w:w="108" w:type="dxa"/>
@@ -3609,7 +3636,7 @@
         <w:tc>
           <w:tcPr>
             <w:tcW w:w="8522" w:type="dxa"/>
-            <w:shd w:val="clear" w:color="auto" w:fill="BEBEBE" w:themeFill="background1" w:themeFillShade="BF"/>
+            <w:shd w:val="clear" w:color="auto" w:fill="80C588" w:themeFill="background1" w:themeFillShade="BF"/>
           </w:tcPr>
           <w:p>
             <w:r>
@@ -3678,7 +3705,7 @@
         <w:tc>
           <w:tcPr>
             <w:tcW w:w="8522" w:type="dxa"/>
-            <w:shd w:val="clear" w:color="auto" w:fill="BEBEBE" w:themeFill="background1" w:themeFillShade="BF"/>
+            <w:shd w:val="clear" w:color="auto" w:fill="80C588" w:themeFill="background1" w:themeFillShade="BF"/>
           </w:tcPr>
           <w:p>
             <w:r>
@@ -3723,11 +3750,17 @@
             <w:insideH w:val="single" w:color="auto" w:sz="4" w:space="0"/>
             <w:insideV w:val="single" w:color="auto" w:sz="4" w:space="0"/>
           </w:tblBorders>
+          <w:tblCellMar>
+            <w:top w:w="0" w:type="dxa"/>
+            <w:left w:w="108" w:type="dxa"/>
+            <w:bottom w:w="0" w:type="dxa"/>
+            <w:right w:w="108" w:type="dxa"/>
+          </w:tblCellMar>
         </w:tblPrEx>
         <w:tc>
           <w:tcPr>
             <w:tcW w:w="8522" w:type="dxa"/>
-            <w:shd w:val="clear" w:color="auto" w:fill="BEBEBE" w:themeFill="background1" w:themeFillShade="BF"/>
+            <w:shd w:val="clear" w:color="auto" w:fill="80C588" w:themeFill="background1" w:themeFillShade="BF"/>
           </w:tcPr>
           <w:p>
             <w:r>
@@ -3753,6 +3786,7 @@
     <w:p>
       <w:pPr>
         <w:rPr>
+          <w:rFonts w:hint="eastAsia"/>
           <w:b/>
           <w:bCs/>
         </w:rPr>
@@ -3763,7 +3797,23 @@
           <w:b/>
           <w:bCs/>
         </w:rPr>
-        <w:t>*** Remark If USE pi zero(bcm2835)</w:t>
+        <w:t xml:space="preserve">*** Remark </w:t>
+      </w:r>
+    </w:p>
+    <w:p>
+      <w:pPr>
+        <w:rPr>
+          <w:b/>
+          <w:bCs/>
+        </w:rPr>
+      </w:pPr>
+      <w:r>
+        <w:rPr>
+          <w:rFonts w:hint="eastAsia"/>
+          <w:b/>
+          <w:bCs/>
+        </w:rPr>
+        <w:t>If USE pi zero(bcm2835)</w:t>
       </w:r>
     </w:p>
     <w:tbl>
@@ -3779,7 +3829,7 @@
           <w:insideH w:val="single" w:color="auto" w:sz="4" w:space="0"/>
           <w:insideV w:val="single" w:color="auto" w:sz="4" w:space="0"/>
         </w:tblBorders>
-        <w:shd w:val="clear" w:color="auto" w:fill="D7D7D7" w:themeFill="background1" w:themeFillShade="D8"/>
+        <w:shd w:val="clear" w:color="auto" w:fill="9ED3A3" w:themeFill="background1" w:themeFillShade="D8"/>
         <w:tblLayout w:type="autofit"/>
         <w:tblCellMar>
           <w:top w:w="0" w:type="dxa"/>
@@ -3801,12 +3851,12 @@
             <w:insideH w:val="single" w:color="auto" w:sz="4" w:space="0"/>
             <w:insideV w:val="single" w:color="auto" w:sz="4" w:space="0"/>
           </w:tblBorders>
-          <w:shd w:val="clear" w:color="auto" w:fill="D7D7D7" w:themeFill="background1" w:themeFillShade="D8"/>
+          <w:shd w:val="clear" w:color="auto" w:fill="9ED3A3" w:themeFill="background1" w:themeFillShade="D8"/>
         </w:tblPrEx>
         <w:tc>
           <w:tcPr>
             <w:tcW w:w="8522" w:type="dxa"/>
-            <w:shd w:val="clear" w:color="auto" w:fill="BEBEBE" w:themeFill="background1" w:themeFillShade="BF"/>
+            <w:shd w:val="clear" w:color="auto" w:fill="80C588" w:themeFill="background1" w:themeFillShade="BF"/>
           </w:tcPr>
           <w:p>
             <w:r>
@@ -3840,7 +3890,24 @@
           <w:b/>
           <w:bCs/>
         </w:rPr>
-        <w:t xml:space="preserve">*** If you wish to usd raspberry pi </w:t>
+        <w:t>If you wish to us</w:t>
+      </w:r>
+      <w:r>
+        <w:rPr>
+          <w:rFonts w:hint="eastAsia"/>
+          <w:b/>
+          <w:bCs/>
+          <w:lang w:val="en-US" w:eastAsia="zh-CN"/>
+        </w:rPr>
+        <w:t>e</w:t>
+      </w:r>
+      <w:r>
+        <w:rPr>
+          <w:rFonts w:hint="eastAsia"/>
+          <w:b/>
+          <w:bCs/>
+        </w:rPr>
+        <w:t xml:space="preserve"> raspberry pi </w:t>
       </w:r>
       <w:r>
         <w:rPr>
@@ -3876,7 +3943,7 @@
           <w:insideH w:val="single" w:color="auto" w:sz="4" w:space="0"/>
           <w:insideV w:val="single" w:color="auto" w:sz="4" w:space="0"/>
         </w:tblBorders>
-        <w:shd w:val="clear" w:color="auto" w:fill="D7D7D7" w:themeFill="background1" w:themeFillShade="D8"/>
+        <w:shd w:val="clear" w:color="auto" w:fill="9ED3A3" w:themeFill="background1" w:themeFillShade="D8"/>
         <w:tblLayout w:type="autofit"/>
         <w:tblCellMar>
           <w:top w:w="0" w:type="dxa"/>
@@ -3898,12 +3965,12 @@
             <w:insideH w:val="single" w:color="auto" w:sz="4" w:space="0"/>
             <w:insideV w:val="single" w:color="auto" w:sz="4" w:space="0"/>
           </w:tblBorders>
-          <w:shd w:val="clear" w:color="auto" w:fill="D7D7D7" w:themeFill="background1" w:themeFillShade="D8"/>
+          <w:shd w:val="clear" w:color="auto" w:fill="9ED3A3" w:themeFill="background1" w:themeFillShade="D8"/>
         </w:tblPrEx>
         <w:tc>
           <w:tcPr>
             <w:tcW w:w="8522" w:type="dxa"/>
-            <w:shd w:val="clear" w:color="auto" w:fill="BEBEBE" w:themeFill="background1" w:themeFillShade="BF"/>
+            <w:shd w:val="clear" w:color="auto" w:fill="80C588" w:themeFill="background1" w:themeFillShade="BF"/>
           </w:tcPr>
           <w:p>
             <w:r>
@@ -3918,6 +3985,179 @@
         <w:t>.</w:t>
       </w:r>
     </w:p>
+    <w:p>
+      <w:pPr>
+        <w:rPr>
+          <w:rFonts w:hint="default" w:eastAsiaTheme="minorEastAsia"/>
+          <w:b/>
+          <w:bCs/>
+          <w:lang w:val="en-US" w:eastAsia="zh-CN"/>
+        </w:rPr>
+      </w:pPr>
+      <w:r>
+        <w:rPr>
+          <w:rFonts w:hint="eastAsia"/>
+          <w:b/>
+          <w:bCs/>
+        </w:rPr>
+        <w:t>If you wish to us</w:t>
+      </w:r>
+      <w:r>
+        <w:rPr>
+          <w:rFonts w:hint="eastAsia"/>
+          <w:b/>
+          <w:bCs/>
+          <w:lang w:val="en-US" w:eastAsia="zh-CN"/>
+        </w:rPr>
+        <w:t>e</w:t>
+      </w:r>
+      <w:r>
+        <w:rPr>
+          <w:rFonts w:hint="eastAsia"/>
+          <w:b/>
+          <w:bCs/>
+        </w:rPr>
+        <w:t xml:space="preserve"> </w:t>
+      </w:r>
+      <w:r>
+        <w:rPr>
+          <w:rFonts w:hint="eastAsia"/>
+          <w:b/>
+          <w:bCs/>
+          <w:lang w:val="en-US" w:eastAsia="zh-CN"/>
+        </w:rPr>
+        <w:t>dual camera for cm4</w:t>
+      </w:r>
+    </w:p>
+    <w:p>
+      <w:pPr>
+        <w:rPr/>
+      </w:pPr>
+      <w:r>
+        <w:rPr>
+          <w:rFonts w:hint="eastAsia"/>
+          <w:lang w:val="en-US" w:eastAsia="zh-CN"/>
+        </w:rPr>
+        <w:t>step1,</w:t>
+      </w:r>
+    </w:p>
+    <w:p>
+      <w:pPr>
+        <w:rPr>
+          <w:rFonts w:hint="eastAsia"/>
+        </w:rPr>
+      </w:pPr>
+      <w:r>
+        <w:rPr>
+          <w:rFonts w:hint="eastAsia"/>
+          <w:lang w:val="en-US" w:eastAsia="zh-CN"/>
+        </w:rPr>
+        <w:t xml:space="preserve">Copy </w:t>
+      </w:r>
+      <w:r>
+        <w:rPr>
+          <w:rFonts w:hint="eastAsia"/>
+          <w:b/>
+          <w:bCs/>
+          <w:lang w:val="en-US" w:eastAsia="zh-CN"/>
+        </w:rPr>
+        <w:t>inno_mipi_ov9281_cm4_dual.dtbo</w:t>
+      </w:r>
+      <w:r>
+        <w:rPr>
+          <w:rFonts w:hint="eastAsia"/>
+          <w:lang w:val="en-US" w:eastAsia="zh-CN"/>
+        </w:rPr>
+        <w:t xml:space="preserve"> to /boot/overlays</w:t>
+      </w:r>
+    </w:p>
+    <w:p>
+      <w:pPr>
+        <w:rPr>
+          <w:rFonts w:hint="eastAsia"/>
+        </w:rPr>
+      </w:pPr>
+      <w:r>
+        <w:rPr>
+          <w:rFonts w:hint="eastAsia"/>
+          <w:lang w:val="en-US" w:eastAsia="zh-CN"/>
+        </w:rPr>
+        <w:t>step2</w:t>
+      </w:r>
+    </w:p>
+    <w:p>
+      <w:pPr>
+        <w:rPr>
+          <w:rFonts w:hint="default"/>
+          <w:lang w:val="en-US"/>
+        </w:rPr>
+      </w:pPr>
+      <w:r>
+        <w:rPr>
+          <w:rFonts w:hint="eastAsia"/>
+          <w:lang w:val="en-US" w:eastAsia="zh-CN"/>
+        </w:rPr>
+        <w:t>Add below content to config.txt then reboot</w:t>
+      </w:r>
+      <w:bookmarkStart w:id="0" w:name="_GoBack"/>
+      <w:bookmarkEnd w:id="0"/>
+    </w:p>
+    <w:tbl>
+      <w:tblPr>
+        <w:tblStyle w:val="11"/>
+        <w:tblW w:w="0" w:type="auto"/>
+        <w:tblInd w:w="0" w:type="dxa"/>
+        <w:tblBorders>
+          <w:top w:val="single" w:color="auto" w:sz="4" w:space="0"/>
+          <w:left w:val="single" w:color="auto" w:sz="4" w:space="0"/>
+          <w:bottom w:val="single" w:color="auto" w:sz="4" w:space="0"/>
+          <w:right w:val="single" w:color="auto" w:sz="4" w:space="0"/>
+          <w:insideH w:val="single" w:color="auto" w:sz="4" w:space="0"/>
+          <w:insideV w:val="single" w:color="auto" w:sz="4" w:space="0"/>
+        </w:tblBorders>
+        <w:shd w:val="clear" w:color="auto" w:fill="9ED3A3" w:themeFill="background1" w:themeFillShade="D8"/>
+        <w:tblLayout w:type="autofit"/>
+        <w:tblCellMar>
+          <w:top w:w="0" w:type="dxa"/>
+          <w:left w:w="108" w:type="dxa"/>
+          <w:bottom w:w="0" w:type="dxa"/>
+          <w:right w:w="108" w:type="dxa"/>
+        </w:tblCellMar>
+      </w:tblPr>
+      <w:tblGrid>
+        <w:gridCol w:w="8522"/>
+      </w:tblGrid>
+      <w:tr>
+        <w:tblPrEx>
+          <w:tblBorders>
+            <w:top w:val="single" w:color="auto" w:sz="4" w:space="0"/>
+            <w:left w:val="single" w:color="auto" w:sz="4" w:space="0"/>
+            <w:bottom w:val="single" w:color="auto" w:sz="4" w:space="0"/>
+            <w:right w:val="single" w:color="auto" w:sz="4" w:space="0"/>
+            <w:insideH w:val="single" w:color="auto" w:sz="4" w:space="0"/>
+            <w:insideV w:val="single" w:color="auto" w:sz="4" w:space="0"/>
+          </w:tblBorders>
+          <w:shd w:val="clear" w:color="auto" w:fill="9ED3A3" w:themeFill="background1" w:themeFillShade="D8"/>
+        </w:tblPrEx>
+        <w:tc>
+          <w:tcPr>
+            <w:tcW w:w="8522" w:type="dxa"/>
+            <w:shd w:val="clear" w:color="auto" w:fill="80C588" w:themeFill="background1" w:themeFillShade="BF"/>
+          </w:tcPr>
+          <w:p>
+            <w:r>
+              <w:t>dtoverlay=</w:t>
+            </w:r>
+            <w:r>
+              <w:rPr>
+                <w:rFonts w:hint="eastAsia"/>
+              </w:rPr>
+              <w:t>inno_mipi_ov7251_cm4_dual</w:t>
+            </w:r>
+          </w:p>
+        </w:tc>
+      </w:tr>
+    </w:tbl>
     <w:p>
       <w:r>
         <w:rPr>
@@ -4474,7 +4714,7 @@
         <w:tc>
           <w:tcPr>
             <w:tcW w:w="8522" w:type="dxa"/>
-            <w:shd w:val="clear" w:color="auto" w:fill="BEBEBE" w:themeFill="background1" w:themeFillShade="BF"/>
+            <w:shd w:val="clear" w:color="auto" w:fill="80C588" w:themeFill="background1" w:themeFillShade="BF"/>
           </w:tcPr>
           <w:p>
             <w:r>
@@ -4547,6 +4787,101 @@
           <w:bCs/>
         </w:rPr>
         <w:t>Get camera module work mode information:</w:t>
+      </w:r>
+    </w:p>
+    <w:tbl>
+      <w:tblPr>
+        <w:tblStyle w:val="11"/>
+        <w:tblW w:w="0" w:type="auto"/>
+        <w:tblInd w:w="0" w:type="dxa"/>
+        <w:tblBorders>
+          <w:top w:val="single" w:color="auto" w:sz="4" w:space="0"/>
+          <w:left w:val="single" w:color="auto" w:sz="4" w:space="0"/>
+          <w:bottom w:val="single" w:color="auto" w:sz="4" w:space="0"/>
+          <w:right w:val="single" w:color="auto" w:sz="4" w:space="0"/>
+          <w:insideH w:val="single" w:color="auto" w:sz="4" w:space="0"/>
+          <w:insideV w:val="single" w:color="auto" w:sz="4" w:space="0"/>
+        </w:tblBorders>
+        <w:tblLayout w:type="autofit"/>
+        <w:tblCellMar>
+          <w:top w:w="0" w:type="dxa"/>
+          <w:left w:w="108" w:type="dxa"/>
+          <w:bottom w:w="0" w:type="dxa"/>
+          <w:right w:w="108" w:type="dxa"/>
+        </w:tblCellMar>
+      </w:tblPr>
+      <w:tblGrid>
+        <w:gridCol w:w="8522"/>
+      </w:tblGrid>
+      <w:tr>
+        <w:tblPrEx>
+          <w:tblBorders>
+            <w:top w:val="single" w:color="auto" w:sz="4" w:space="0"/>
+            <w:left w:val="single" w:color="auto" w:sz="4" w:space="0"/>
+            <w:bottom w:val="single" w:color="auto" w:sz="4" w:space="0"/>
+            <w:right w:val="single" w:color="auto" w:sz="4" w:space="0"/>
+            <w:insideH w:val="single" w:color="auto" w:sz="4" w:space="0"/>
+            <w:insideV w:val="single" w:color="auto" w:sz="4" w:space="0"/>
+          </w:tblBorders>
+        </w:tblPrEx>
+        <w:tc>
+          <w:tcPr>
+            <w:tcW w:w="8522" w:type="dxa"/>
+            <w:shd w:val="clear" w:color="auto" w:fill="80C588" w:themeFill="background1" w:themeFillShade="BF"/>
+          </w:tcPr>
+          <w:p>
+            <w:pPr>
+              <w:rPr>
+                <w:b/>
+                <w:bCs/>
+              </w:rPr>
+            </w:pPr>
+            <w:r>
+              <w:t>$ modinfo inno_mipi_ov7251</w:t>
+            </w:r>
+          </w:p>
+        </w:tc>
+      </w:tr>
+    </w:tbl>
+    <w:p>
+      <w:pPr>
+        <w:rPr>
+          <w:b/>
+          <w:bCs/>
+        </w:rPr>
+      </w:pPr>
+    </w:p>
+    <w:p>
+      <w:pPr>
+        <w:pStyle w:val="2"/>
+      </w:pPr>
+      <w:r>
+        <w:rPr>
+          <w:rFonts w:hint="eastAsia"/>
+        </w:rPr>
+        <w:t>S</w:t>
+      </w:r>
+      <w:r>
+        <w:t xml:space="preserve">oftware </w:t>
+      </w:r>
+      <w:r>
+        <w:rPr>
+          <w:rFonts w:hint="eastAsia"/>
+        </w:rPr>
+        <w:t>T</w:t>
+      </w:r>
+      <w:r>
+        <w:t>rigger:</w:t>
+      </w:r>
+    </w:p>
+    <w:p>
+      <w:r>
+        <w:t>Step1 : set camera work in external trigger mode.</w:t>
+      </w:r>
+    </w:p>
+    <w:p>
+      <w:r>
+        <w:t>For example set the module work in mode3</w:t>
       </w:r>
     </w:p>
     <w:tbl>
@@ -4593,42 +4928,36 @@
         <w:tc>
           <w:tcPr>
             <w:tcW w:w="8522" w:type="dxa"/>
-            <w:shd w:val="clear" w:color="auto" w:fill="BEBEBE" w:themeFill="background1" w:themeFillShade="BF"/>
+            <w:shd w:val="clear" w:color="auto" w:fill="80C588" w:themeFill="background1" w:themeFillShade="BF"/>
           </w:tcPr>
           <w:p>
-            <w:pPr>
-              <w:rPr>
-                <w:b/>
-                <w:bCs/>
-              </w:rPr>
-            </w:pPr>
-            <w:r>
-              <w:t>$ modinfo inno_mipi_ov7251</w:t>
+            <w:r>
+              <w:rPr>
+                <w:rFonts w:hint="eastAsia"/>
+              </w:rPr>
+              <w:t>$</w:t>
+            </w:r>
+            <w:r>
+              <w:t xml:space="preserve"> sudo make setmode</w:t>
+            </w:r>
+            <w:r>
+              <w:rPr>
+                <w:rFonts w:hint="eastAsia"/>
+              </w:rPr>
+              <w:t>3</w:t>
             </w:r>
           </w:p>
         </w:tc>
       </w:tr>
     </w:tbl>
     <w:p>
-      <w:pPr>
-        <w:rPr>
-          <w:b/>
-          <w:bCs/>
-        </w:rPr>
-      </w:pPr>
-    </w:p>
-    <w:p>
-      <w:pPr>
-        <w:pStyle w:val="2"/>
-      </w:pPr>
-      <w:r>
-        <w:rPr>
-          <w:rFonts w:hint="eastAsia"/>
-        </w:rPr>
-        <w:t>S</w:t>
-      </w:r>
-      <w:r>
-        <w:t xml:space="preserve">oftware </w:t>
+      <w:r>
+        <w:t xml:space="preserve">Open /dev/video0 device in VLC </w:t>
+      </w:r>
+    </w:p>
+    <w:p>
+      <w:r>
+        <w:t xml:space="preserve">Step2: </w:t>
       </w:r>
       <w:r>
         <w:rPr>
@@ -4637,17 +4966,77 @@
         <w:t>T</w:t>
       </w:r>
       <w:r>
-        <w:t>rigger:</w:t>
-      </w:r>
-    </w:p>
-    <w:p>
-      <w:r>
-        <w:t>Step1 : set camera work in external trigger mode.</w:t>
-      </w:r>
-    </w:p>
-    <w:p>
-      <w:r>
-        <w:t>For example set the module work in mode3</w:t>
+        <w:t>ransfer software trigger command through i2c bus</w:t>
+      </w:r>
+    </w:p>
+    <w:tbl>
+      <w:tblPr>
+        <w:tblStyle w:val="11"/>
+        <w:tblW w:w="0" w:type="auto"/>
+        <w:tblInd w:w="0" w:type="dxa"/>
+        <w:tblBorders>
+          <w:top w:val="single" w:color="auto" w:sz="4" w:space="0"/>
+          <w:left w:val="single" w:color="auto" w:sz="4" w:space="0"/>
+          <w:bottom w:val="single" w:color="auto" w:sz="4" w:space="0"/>
+          <w:right w:val="single" w:color="auto" w:sz="4" w:space="0"/>
+          <w:insideH w:val="single" w:color="auto" w:sz="4" w:space="0"/>
+          <w:insideV w:val="single" w:color="auto" w:sz="4" w:space="0"/>
+        </w:tblBorders>
+        <w:tblLayout w:type="autofit"/>
+        <w:tblCellMar>
+          <w:top w:w="0" w:type="dxa"/>
+          <w:left w:w="108" w:type="dxa"/>
+          <w:bottom w:w="0" w:type="dxa"/>
+          <w:right w:w="108" w:type="dxa"/>
+        </w:tblCellMar>
+      </w:tblPr>
+      <w:tblGrid>
+        <w:gridCol w:w="8522"/>
+      </w:tblGrid>
+      <w:tr>
+        <w:tblPrEx>
+          <w:tblBorders>
+            <w:top w:val="single" w:color="auto" w:sz="4" w:space="0"/>
+            <w:left w:val="single" w:color="auto" w:sz="4" w:space="0"/>
+            <w:bottom w:val="single" w:color="auto" w:sz="4" w:space="0"/>
+            <w:right w:val="single" w:color="auto" w:sz="4" w:space="0"/>
+            <w:insideH w:val="single" w:color="auto" w:sz="4" w:space="0"/>
+            <w:insideV w:val="single" w:color="auto" w:sz="4" w:space="0"/>
+          </w:tblBorders>
+        </w:tblPrEx>
+        <w:tc>
+          <w:tcPr>
+            <w:tcW w:w="8522" w:type="dxa"/>
+            <w:shd w:val="clear" w:color="auto" w:fill="80C588" w:themeFill="background1" w:themeFillShade="BF"/>
+          </w:tcPr>
+          <w:p>
+            <w:r>
+              <w:rPr>
+                <w:rFonts w:hint="eastAsia"/>
+              </w:rPr>
+              <w:t>$</w:t>
+            </w:r>
+            <w:r>
+              <w:t xml:space="preserve"> i2cset -f -y 10 0x10 204 1 </w:t>
+            </w:r>
+          </w:p>
+        </w:tc>
+      </w:tr>
+    </w:tbl>
+    <w:p>
+      <w:r>
+        <w:t>Remark:</w:t>
+      </w:r>
+    </w:p>
+    <w:p>
+      <w:r>
+        <w:rPr>
+          <w:rFonts w:hint="eastAsia"/>
+        </w:rPr>
+        <w:t xml:space="preserve">*** </w:t>
+      </w:r>
+      <w:r>
+        <w:t>Set the sensor module back to external hardware trigger mode by:</w:t>
       </w:r>
     </w:p>
     <w:tbl>
@@ -4694,7 +5083,7 @@
         <w:tc>
           <w:tcPr>
             <w:tcW w:w="8522" w:type="dxa"/>
-            <w:shd w:val="clear" w:color="auto" w:fill="BEBEBE" w:themeFill="background1" w:themeFillShade="BF"/>
+            <w:shd w:val="clear" w:color="auto" w:fill="80C588" w:themeFill="background1" w:themeFillShade="BF"/>
           </w:tcPr>
           <w:p>
             <w:r>
@@ -4704,26 +5093,25 @@
               <w:t>$</w:t>
             </w:r>
             <w:r>
-              <w:t xml:space="preserve"> sudo make setmode</w:t>
-            </w:r>
-            <w:r>
-              <w:rPr>
-                <w:rFonts w:hint="eastAsia"/>
-              </w:rPr>
-              <w:t>3</w:t>
+              <w:t xml:space="preserve"> i2cset -f -y 10 0x10 204 0</w:t>
             </w:r>
           </w:p>
         </w:tc>
       </w:tr>
     </w:tbl>
-    <w:p>
-      <w:r>
-        <w:t xml:space="preserve">Open /dev/video0 device in VLC </w:t>
-      </w:r>
-    </w:p>
-    <w:p>
-      <w:r>
-        <w:t xml:space="preserve">Step2: </w:t>
+    <w:p/>
+    <w:p>
+      <w:pPr>
+        <w:pStyle w:val="2"/>
+      </w:pPr>
+      <w:r>
+        <w:rPr>
+          <w:rFonts w:hint="eastAsia"/>
+        </w:rPr>
+        <w:t>H</w:t>
+      </w:r>
+      <w:r>
+        <w:t xml:space="preserve">ardware </w:t>
       </w:r>
       <w:r>
         <w:rPr>
@@ -4732,7 +5120,18 @@
         <w:t>T</w:t>
       </w:r>
       <w:r>
-        <w:t>ransfer software trigger command through i2c bus</w:t>
+        <w:t>rigger :</w:t>
+      </w:r>
+    </w:p>
+    <w:p>
+      <w:r>
+        <w:rPr>
+          <w:rFonts w:hint="eastAsia"/>
+        </w:rPr>
+        <w:t xml:space="preserve">*** </w:t>
+      </w:r>
+      <w:r>
+        <w:t>Set the sensor module back to external hardware trigger mode by:</w:t>
       </w:r>
     </w:p>
     <w:tbl>
@@ -4779,77 +5178,7 @@
         <w:tc>
           <w:tcPr>
             <w:tcW w:w="8522" w:type="dxa"/>
-            <w:shd w:val="clear" w:color="auto" w:fill="BEBEBE" w:themeFill="background1" w:themeFillShade="BF"/>
-          </w:tcPr>
-          <w:p>
-            <w:r>
-              <w:rPr>
-                <w:rFonts w:hint="eastAsia"/>
-              </w:rPr>
-              <w:t>$</w:t>
-            </w:r>
-            <w:r>
-              <w:t xml:space="preserve"> i2cset -f -y 10 0x10 204 1 </w:t>
-            </w:r>
-          </w:p>
-        </w:tc>
-      </w:tr>
-    </w:tbl>
-    <w:p>
-      <w:r>
-        <w:t>Remark:</w:t>
-      </w:r>
-    </w:p>
-    <w:p>
-      <w:r>
-        <w:rPr>
-          <w:rFonts w:hint="eastAsia"/>
-        </w:rPr>
-        <w:t xml:space="preserve">*** </w:t>
-      </w:r>
-      <w:r>
-        <w:t>Set the sensor module back to external hardware trigger mode by:</w:t>
-      </w:r>
-    </w:p>
-    <w:tbl>
-      <w:tblPr>
-        <w:tblStyle w:val="11"/>
-        <w:tblW w:w="0" w:type="auto"/>
-        <w:tblInd w:w="0" w:type="dxa"/>
-        <w:tblBorders>
-          <w:top w:val="single" w:color="auto" w:sz="4" w:space="0"/>
-          <w:left w:val="single" w:color="auto" w:sz="4" w:space="0"/>
-          <w:bottom w:val="single" w:color="auto" w:sz="4" w:space="0"/>
-          <w:right w:val="single" w:color="auto" w:sz="4" w:space="0"/>
-          <w:insideH w:val="single" w:color="auto" w:sz="4" w:space="0"/>
-          <w:insideV w:val="single" w:color="auto" w:sz="4" w:space="0"/>
-        </w:tblBorders>
-        <w:tblLayout w:type="autofit"/>
-        <w:tblCellMar>
-          <w:top w:w="0" w:type="dxa"/>
-          <w:left w:w="108" w:type="dxa"/>
-          <w:bottom w:w="0" w:type="dxa"/>
-          <w:right w:w="108" w:type="dxa"/>
-        </w:tblCellMar>
-      </w:tblPr>
-      <w:tblGrid>
-        <w:gridCol w:w="8522"/>
-      </w:tblGrid>
-      <w:tr>
-        <w:tblPrEx>
-          <w:tblBorders>
-            <w:top w:val="single" w:color="auto" w:sz="4" w:space="0"/>
-            <w:left w:val="single" w:color="auto" w:sz="4" w:space="0"/>
-            <w:bottom w:val="single" w:color="auto" w:sz="4" w:space="0"/>
-            <w:right w:val="single" w:color="auto" w:sz="4" w:space="0"/>
-            <w:insideH w:val="single" w:color="auto" w:sz="4" w:space="0"/>
-            <w:insideV w:val="single" w:color="auto" w:sz="4" w:space="0"/>
-          </w:tblBorders>
-        </w:tblPrEx>
-        <w:tc>
-          <w:tcPr>
-            <w:tcW w:w="8522" w:type="dxa"/>
-            <w:shd w:val="clear" w:color="auto" w:fill="BEBEBE" w:themeFill="background1" w:themeFillShade="BF"/>
+            <w:shd w:val="clear" w:color="auto" w:fill="80C588" w:themeFill="background1" w:themeFillShade="BF"/>
           </w:tcPr>
           <w:p>
             <w:r>
@@ -4868,36 +5197,166 @@
     <w:p/>
     <w:p>
       <w:pPr>
-        <w:pStyle w:val="2"/>
+        <w:pStyle w:val="3"/>
       </w:pPr>
       <w:r>
         <w:rPr>
           <w:rFonts w:hint="eastAsia"/>
         </w:rPr>
-        <w:t>H</w:t>
-      </w:r>
-      <w:r>
-        <w:t xml:space="preserve">ardware </w:t>
-      </w:r>
-      <w:r>
-        <w:rPr>
-          <w:rFonts w:hint="eastAsia"/>
-        </w:rPr>
-        <w:t>T</w:t>
-      </w:r>
-      <w:r>
-        <w:t>rigger :</w:t>
-      </w:r>
-    </w:p>
-    <w:p>
-      <w:r>
-        <w:rPr>
-          <w:rFonts w:hint="eastAsia"/>
-        </w:rPr>
-        <w:t xml:space="preserve">*** </w:t>
-      </w:r>
-      <w:r>
-        <w:t>Set the sensor module back to external hardware trigger mode by:</w:t>
+        <w:t>Wire connection</w:t>
+      </w:r>
+    </w:p>
+    <w:p>
+      <w:pPr>
+        <w:widowControl/>
+        <w:jc w:val="left"/>
+      </w:pPr>
+      <w:r>
+        <w:rPr>
+          <w:rFonts w:ascii="Calibri" w:hAnsi="Calibri" w:eastAsia="宋体" w:cs="Calibri"/>
+          <w:color w:val="000000"/>
+          <w:kern w:val="0"/>
+          <w:sz w:val="20"/>
+          <w:szCs w:val="20"/>
+          <w:lang w:bidi="ar"/>
+        </w:rPr>
+        <w:t>You can connect the TRIG- to the GND Pin and connect the TRIG+ to 3.3V Pin of Raspberry Pi to</w:t>
+      </w:r>
+    </w:p>
+    <w:p>
+      <w:pPr>
+        <w:widowControl/>
+        <w:jc w:val="left"/>
+        <w:rPr>
+          <w:rFonts w:ascii="Calibri" w:hAnsi="Calibri" w:eastAsia="宋体" w:cs="Calibri"/>
+          <w:color w:val="000000"/>
+          <w:kern w:val="0"/>
+          <w:sz w:val="20"/>
+          <w:szCs w:val="20"/>
+          <w:lang w:bidi="ar"/>
+        </w:rPr>
+      </w:pPr>
+      <w:r>
+        <w:rPr>
+          <w:rFonts w:ascii="Calibri" w:hAnsi="Calibri" w:eastAsia="宋体" w:cs="Calibri"/>
+          <w:color w:val="000000"/>
+          <w:kern w:val="0"/>
+          <w:sz w:val="20"/>
+          <w:szCs w:val="20"/>
+          <w:lang w:bidi="ar"/>
+        </w:rPr>
+        <w:t>simulate a trigger signal. This test function will comes with repeated trigger signal sometime.</w:t>
+      </w:r>
+    </w:p>
+    <w:p>
+      <w:pPr>
+        <w:widowControl/>
+        <w:jc w:val="left"/>
+        <w:rPr>
+          <w:rFonts w:ascii="Calibri" w:hAnsi="Calibri" w:eastAsia="宋体" w:cs="Calibri"/>
+          <w:color w:val="000000"/>
+          <w:kern w:val="0"/>
+          <w:sz w:val="20"/>
+          <w:szCs w:val="20"/>
+          <w:lang w:bidi="ar"/>
+        </w:rPr>
+      </w:pPr>
+      <w:r>
+        <w:drawing>
+          <wp:inline distT="0" distB="0" distL="114300" distR="114300">
+            <wp:extent cx="4798060" cy="4798060"/>
+            <wp:effectExtent l="0" t="0" r="2540" b="2540"/>
+            <wp:docPr id="20" name="图片 17"/>
+            <wp:cNvGraphicFramePr>
+              <a:graphicFrameLocks xmlns:a="http://schemas.openxmlformats.org/drawingml/2006/main" noChangeAspect="1"/>
+            </wp:cNvGraphicFramePr>
+            <a:graphic xmlns:a="http://schemas.openxmlformats.org/drawingml/2006/main">
+              <a:graphicData uri="http://schemas.openxmlformats.org/drawingml/2006/picture">
+                <pic:pic xmlns:pic="http://schemas.openxmlformats.org/drawingml/2006/picture">
+                  <pic:nvPicPr>
+                    <pic:cNvPr id="20" name="图片 17"/>
+                    <pic:cNvPicPr>
+                      <a:picLocks noChangeAspect="1"/>
+                    </pic:cNvPicPr>
+                  </pic:nvPicPr>
+                  <pic:blipFill>
+                    <a:blip r:embed="rId23"/>
+                    <a:stretch>
+                      <a:fillRect/>
+                    </a:stretch>
+                  </pic:blipFill>
+                  <pic:spPr>
+                    <a:xfrm>
+                      <a:off x="0" y="0"/>
+                      <a:ext cx="4798060" cy="4798060"/>
+                    </a:xfrm>
+                    <a:prstGeom prst="rect">
+                      <a:avLst/>
+                    </a:prstGeom>
+                    <a:noFill/>
+                    <a:ln>
+                      <a:noFill/>
+                    </a:ln>
+                  </pic:spPr>
+                </pic:pic>
+              </a:graphicData>
+            </a:graphic>
+          </wp:inline>
+        </w:drawing>
+      </w:r>
+      <w:r>
+        <w:drawing>
+          <wp:inline distT="0" distB="0" distL="114300" distR="114300">
+            <wp:extent cx="1790700" cy="781050"/>
+            <wp:effectExtent l="0" t="0" r="0" b="0"/>
+            <wp:docPr id="21" name="图片 18"/>
+            <wp:cNvGraphicFramePr>
+              <a:graphicFrameLocks xmlns:a="http://schemas.openxmlformats.org/drawingml/2006/main" noChangeAspect="1"/>
+            </wp:cNvGraphicFramePr>
+            <a:graphic xmlns:a="http://schemas.openxmlformats.org/drawingml/2006/main">
+              <a:graphicData uri="http://schemas.openxmlformats.org/drawingml/2006/picture">
+                <pic:pic xmlns:pic="http://schemas.openxmlformats.org/drawingml/2006/picture">
+                  <pic:nvPicPr>
+                    <pic:cNvPr id="21" name="图片 18"/>
+                    <pic:cNvPicPr>
+                      <a:picLocks noChangeAspect="1"/>
+                    </pic:cNvPicPr>
+                  </pic:nvPicPr>
+                  <pic:blipFill>
+                    <a:blip r:embed="rId24"/>
+                    <a:stretch>
+                      <a:fillRect/>
+                    </a:stretch>
+                  </pic:blipFill>
+                  <pic:spPr>
+                    <a:xfrm>
+                      <a:off x="0" y="0"/>
+                      <a:ext cx="1790700" cy="781050"/>
+                    </a:xfrm>
+                    <a:prstGeom prst="rect">
+                      <a:avLst/>
+                    </a:prstGeom>
+                    <a:noFill/>
+                    <a:ln>
+                      <a:noFill/>
+                    </a:ln>
+                  </pic:spPr>
+                </pic:pic>
+              </a:graphicData>
+            </a:graphic>
+          </wp:inline>
+        </w:drawing>
+      </w:r>
+    </w:p>
+    <w:p/>
+    <w:p>
+      <w:r>
+        <w:t>Step1 : set camera work in external trigger mode.</w:t>
+      </w:r>
+    </w:p>
+    <w:p>
+      <w:r>
+        <w:t>For example set the module work in mode3</w:t>
       </w:r>
     </w:p>
     <w:tbl>
@@ -4944,7 +5403,7 @@
         <w:tc>
           <w:tcPr>
             <w:tcW w:w="8522" w:type="dxa"/>
-            <w:shd w:val="clear" w:color="auto" w:fill="BEBEBE" w:themeFill="background1" w:themeFillShade="BF"/>
+            <w:shd w:val="clear" w:color="auto" w:fill="80C588" w:themeFill="background1" w:themeFillShade="BF"/>
           </w:tcPr>
           <w:p>
             <w:r>
@@ -4954,175 +5413,25 @@
               <w:t>$</w:t>
             </w:r>
             <w:r>
-              <w:t xml:space="preserve"> i2cset -f -y 10 0x10 204 0</w:t>
+              <w:t xml:space="preserve"> sudo make setmode3</w:t>
             </w:r>
           </w:p>
         </w:tc>
       </w:tr>
     </w:tbl>
-    <w:p/>
-    <w:p>
-      <w:pPr>
-        <w:pStyle w:val="3"/>
-      </w:pPr>
-      <w:r>
-        <w:rPr>
-          <w:rFonts w:hint="eastAsia"/>
-        </w:rPr>
-        <w:t>Wire connection</w:t>
-      </w:r>
-    </w:p>
-    <w:p>
-      <w:pPr>
-        <w:widowControl/>
-        <w:jc w:val="left"/>
-      </w:pPr>
-      <w:r>
-        <w:rPr>
-          <w:rFonts w:ascii="Calibri" w:hAnsi="Calibri" w:eastAsia="宋体" w:cs="Calibri"/>
-          <w:color w:val="000000"/>
-          <w:kern w:val="0"/>
-          <w:sz w:val="20"/>
-          <w:szCs w:val="20"/>
-          <w:lang w:bidi="ar"/>
-        </w:rPr>
-        <w:t>You can connect the TRIG- to the GND Pin and connect the TRIG+ to 3.3V Pin of Raspberry Pi to</w:t>
-      </w:r>
-    </w:p>
-    <w:p>
-      <w:pPr>
-        <w:widowControl/>
-        <w:jc w:val="left"/>
-        <w:rPr>
-          <w:rFonts w:ascii="Calibri" w:hAnsi="Calibri" w:eastAsia="宋体" w:cs="Calibri"/>
-          <w:color w:val="000000"/>
-          <w:kern w:val="0"/>
-          <w:sz w:val="20"/>
-          <w:szCs w:val="20"/>
-          <w:lang w:bidi="ar"/>
-        </w:rPr>
-      </w:pPr>
-      <w:r>
-        <w:rPr>
-          <w:rFonts w:ascii="Calibri" w:hAnsi="Calibri" w:eastAsia="宋体" w:cs="Calibri"/>
-          <w:color w:val="000000"/>
-          <w:kern w:val="0"/>
-          <w:sz w:val="20"/>
-          <w:szCs w:val="20"/>
-          <w:lang w:bidi="ar"/>
-        </w:rPr>
-        <w:t>simulate a trigger signal. This test function will comes with repeated trigger signal sometime.</w:t>
-      </w:r>
-    </w:p>
-    <w:p>
-      <w:pPr>
-        <w:widowControl/>
-        <w:jc w:val="left"/>
-        <w:rPr>
-          <w:rFonts w:ascii="Calibri" w:hAnsi="Calibri" w:eastAsia="宋体" w:cs="Calibri"/>
-          <w:color w:val="000000"/>
-          <w:kern w:val="0"/>
-          <w:sz w:val="20"/>
-          <w:szCs w:val="20"/>
-          <w:lang w:bidi="ar"/>
-        </w:rPr>
-      </w:pPr>
-      <w:r>
-        <w:drawing>
-          <wp:inline distT="0" distB="0" distL="114300" distR="114300">
-            <wp:extent cx="4798060" cy="4798060"/>
-            <wp:effectExtent l="0" t="0" r="2540" b="2540"/>
-            <wp:docPr id="20" name="图片 17"/>
-            <wp:cNvGraphicFramePr>
-              <a:graphicFrameLocks xmlns:a="http://schemas.openxmlformats.org/drawingml/2006/main" noChangeAspect="1"/>
-            </wp:cNvGraphicFramePr>
-            <a:graphic xmlns:a="http://schemas.openxmlformats.org/drawingml/2006/main">
-              <a:graphicData uri="http://schemas.openxmlformats.org/drawingml/2006/picture">
-                <pic:pic xmlns:pic="http://schemas.openxmlformats.org/drawingml/2006/picture">
-                  <pic:nvPicPr>
-                    <pic:cNvPr id="20" name="图片 17"/>
-                    <pic:cNvPicPr>
-                      <a:picLocks noChangeAspect="1"/>
-                    </pic:cNvPicPr>
-                  </pic:nvPicPr>
-                  <pic:blipFill>
-                    <a:blip r:embed="rId23"/>
-                    <a:stretch>
-                      <a:fillRect/>
-                    </a:stretch>
-                  </pic:blipFill>
-                  <pic:spPr>
-                    <a:xfrm>
-                      <a:off x="0" y="0"/>
-                      <a:ext cx="4798060" cy="4798060"/>
-                    </a:xfrm>
-                    <a:prstGeom prst="rect">
-                      <a:avLst/>
-                    </a:prstGeom>
-                    <a:noFill/>
-                    <a:ln>
-                      <a:noFill/>
-                    </a:ln>
-                  </pic:spPr>
-                </pic:pic>
-              </a:graphicData>
-            </a:graphic>
-          </wp:inline>
-        </w:drawing>
-      </w:r>
-      <w:r>
-        <w:drawing>
-          <wp:inline distT="0" distB="0" distL="114300" distR="114300">
-            <wp:extent cx="1790700" cy="781050"/>
-            <wp:effectExtent l="0" t="0" r="0" b="0"/>
-            <wp:docPr id="21" name="图片 18"/>
-            <wp:cNvGraphicFramePr>
-              <a:graphicFrameLocks xmlns:a="http://schemas.openxmlformats.org/drawingml/2006/main" noChangeAspect="1"/>
-            </wp:cNvGraphicFramePr>
-            <a:graphic xmlns:a="http://schemas.openxmlformats.org/drawingml/2006/main">
-              <a:graphicData uri="http://schemas.openxmlformats.org/drawingml/2006/picture">
-                <pic:pic xmlns:pic="http://schemas.openxmlformats.org/drawingml/2006/picture">
-                  <pic:nvPicPr>
-                    <pic:cNvPr id="21" name="图片 18"/>
-                    <pic:cNvPicPr>
-                      <a:picLocks noChangeAspect="1"/>
-                    </pic:cNvPicPr>
-                  </pic:nvPicPr>
-                  <pic:blipFill>
-                    <a:blip r:embed="rId24"/>
-                    <a:stretch>
-                      <a:fillRect/>
-                    </a:stretch>
-                  </pic:blipFill>
-                  <pic:spPr>
-                    <a:xfrm>
-                      <a:off x="0" y="0"/>
-                      <a:ext cx="1790700" cy="781050"/>
-                    </a:xfrm>
-                    <a:prstGeom prst="rect">
-                      <a:avLst/>
-                    </a:prstGeom>
-                    <a:noFill/>
-                    <a:ln>
-                      <a:noFill/>
-                    </a:ln>
-                  </pic:spPr>
-                </pic:pic>
-              </a:graphicData>
-            </a:graphic>
-          </wp:inline>
-        </w:drawing>
-      </w:r>
-    </w:p>
-    <w:p/>
-    <w:p>
-      <w:r>
-        <w:t>Step1 : set camera work in external trigger mode.</w:t>
-      </w:r>
-    </w:p>
-    <w:p>
-      <w:r>
-        <w:t>For example set the module work in mode3</w:t>
+    <w:p>
+      <w:r>
+        <w:t xml:space="preserve">Open /dev/video0 device in VLC </w:t>
+      </w:r>
+    </w:p>
+    <w:p>
+      <w:r>
+        <w:t>Step2: Put external trigger signal through TRIG pin head.</w:t>
+      </w:r>
+    </w:p>
+    <w:p>
+      <w:r>
+        <w:t>For example a 3.3v gpio rising edge signal will trigger the frame output.</w:t>
       </w:r>
     </w:p>
     <w:tbl>
@@ -5169,82 +5478,7 @@
         <w:tc>
           <w:tcPr>
             <w:tcW w:w="8522" w:type="dxa"/>
-            <w:shd w:val="clear" w:color="auto" w:fill="BEBEBE" w:themeFill="background1" w:themeFillShade="BF"/>
-          </w:tcPr>
-          <w:p>
-            <w:r>
-              <w:rPr>
-                <w:rFonts w:hint="eastAsia"/>
-              </w:rPr>
-              <w:t>$</w:t>
-            </w:r>
-            <w:r>
-              <w:t xml:space="preserve"> sudo make setmode3</w:t>
-            </w:r>
-          </w:p>
-        </w:tc>
-      </w:tr>
-    </w:tbl>
-    <w:p>
-      <w:r>
-        <w:t xml:space="preserve">Open /dev/video0 device in VLC </w:t>
-      </w:r>
-    </w:p>
-    <w:p>
-      <w:r>
-        <w:t>Step2: Put external trigger signal through TRIG pin head.</w:t>
-      </w:r>
-    </w:p>
-    <w:p>
-      <w:r>
-        <w:t>For example a 3.3v gpio rising edge signal will trigger the frame output.</w:t>
-      </w:r>
-    </w:p>
-    <w:tbl>
-      <w:tblPr>
-        <w:tblStyle w:val="11"/>
-        <w:tblW w:w="0" w:type="auto"/>
-        <w:tblInd w:w="0" w:type="dxa"/>
-        <w:tblBorders>
-          <w:top w:val="single" w:color="auto" w:sz="4" w:space="0"/>
-          <w:left w:val="single" w:color="auto" w:sz="4" w:space="0"/>
-          <w:bottom w:val="single" w:color="auto" w:sz="4" w:space="0"/>
-          <w:right w:val="single" w:color="auto" w:sz="4" w:space="0"/>
-          <w:insideH w:val="single" w:color="auto" w:sz="4" w:space="0"/>
-          <w:insideV w:val="single" w:color="auto" w:sz="4" w:space="0"/>
-        </w:tblBorders>
-        <w:tblLayout w:type="autofit"/>
-        <w:tblCellMar>
-          <w:top w:w="0" w:type="dxa"/>
-          <w:left w:w="108" w:type="dxa"/>
-          <w:bottom w:w="0" w:type="dxa"/>
-          <w:right w:w="108" w:type="dxa"/>
-        </w:tblCellMar>
-      </w:tblPr>
-      <w:tblGrid>
-        <w:gridCol w:w="8522"/>
-      </w:tblGrid>
-      <w:tr>
-        <w:tblPrEx>
-          <w:tblBorders>
-            <w:top w:val="single" w:color="auto" w:sz="4" w:space="0"/>
-            <w:left w:val="single" w:color="auto" w:sz="4" w:space="0"/>
-            <w:bottom w:val="single" w:color="auto" w:sz="4" w:space="0"/>
-            <w:right w:val="single" w:color="auto" w:sz="4" w:space="0"/>
-            <w:insideH w:val="single" w:color="auto" w:sz="4" w:space="0"/>
-            <w:insideV w:val="single" w:color="auto" w:sz="4" w:space="0"/>
-          </w:tblBorders>
-          <w:tblCellMar>
-            <w:top w:w="0" w:type="dxa"/>
-            <w:left w:w="108" w:type="dxa"/>
-            <w:bottom w:w="0" w:type="dxa"/>
-            <w:right w:w="108" w:type="dxa"/>
-          </w:tblCellMar>
-        </w:tblPrEx>
-        <w:tc>
-          <w:tcPr>
-            <w:tcW w:w="8522" w:type="dxa"/>
-            <w:shd w:val="clear" w:color="auto" w:fill="BEBEBE" w:themeFill="background1" w:themeFillShade="BF"/>
+            <w:shd w:val="clear" w:color="auto" w:fill="80C588" w:themeFill="background1" w:themeFillShade="BF"/>
           </w:tcPr>
           <w:p>
             <w:r>
@@ -6104,6 +6338,7 @@
     <w:name w:val="标题 4 字符"/>
     <w:basedOn w:val="12"/>
     <w:link w:val="5"/>
+    <w:qFormat/>
     <w:uiPriority w:val="9"/>
     <w:rPr>
       <w:rFonts w:asciiTheme="majorHAnsi" w:hAnsiTheme="majorHAnsi" w:eastAsiaTheme="majorEastAsia" w:cstheme="majorBidi"/>
@@ -6118,6 +6353,7 @@
     <w:name w:val="标题 5 字符"/>
     <w:basedOn w:val="12"/>
     <w:link w:val="6"/>
+    <w:qFormat/>
     <w:uiPriority w:val="9"/>
     <w:rPr>
       <w:rFonts w:asciiTheme="minorHAnsi" w:hAnsiTheme="minorHAnsi" w:eastAsiaTheme="minorEastAsia" w:cstheme="minorBidi"/>
@@ -6146,6 +6382,7 @@
   <w:style w:type="character" w:customStyle="1" w:styleId="17">
     <w:name w:val="font51"/>
     <w:basedOn w:val="12"/>
+    <w:qFormat/>
     <w:uiPriority w:val="0"/>
     <w:rPr>
       <w:rFonts w:hint="eastAsia" w:ascii="宋体" w:hAnsi="宋体" w:eastAsia="宋体" w:cs="宋体"/>
@@ -6180,7 +6417,7 @@
         <a:sysClr val="windowText" lastClr="000000"/>
       </a:dk1>
       <a:lt1>
-        <a:sysClr val="window" lastClr="FFFFFF"/>
+        <a:sysClr val="window" lastClr="CCE8CF"/>
       </a:lt1>
       <a:dk2>
         <a:srgbClr val="44546A"/>

</xml_diff>